<commit_message>
docs: upgrade to integrated DPIA/AIA framework and add Rights Matrix
</commit_message>
<xml_diff>
--- a/5-2-2026-pia_files/PIA_RecruitSmart_v1.0_2026-03-05_INTERNAL_.docx
+++ b/5-2-2026-pia_files/PIA_RecruitSmart_v1.0_2026-03-05_INTERNAL_.docx
@@ -417,19 +417,7 @@
         <w:rPr>
           <w:rFonts w:eastAsia="Times New Roman"/>
         </w:rPr>
-        <w:t xml:space="preserve">' system is an </w:t>
-      </w:r>
-      <w:r>
-        <w:rPr>
-          <w:rFonts w:eastAsia="Times New Roman"/>
-        </w:rPr>
-        <w:t>AI-driven decision-support tool designed to streamline the initial stages of the recruitment process. The processing involves the automated extraction of professional skills, experience, and educational background from candidate CVs to generate a 'match-sc</w:t>
-      </w:r>
-      <w:r>
-        <w:rPr>
-          <w:rFonts w:eastAsia="Times New Roman"/>
-        </w:rPr>
-        <w:t>ore' against specific job descriptions.</w:t>
+        <w:t>' system is an AI-driven decision-support tool designed to streamline the initial stages of the recruitment process. The processing involves the automated extraction of professional skills, experience, and educational background from candidate CVs to generate a 'match-score' against specific job descriptions.</w:t>
       </w:r>
     </w:p>
     <w:p>
@@ -511,13 +499,7 @@
         <w:rPr>
           <w:rFonts w:eastAsia="Times New Roman"/>
         </w:rPr>
-        <w:t>A critical component of this processing is the algorit</w:t>
-      </w:r>
-      <w:r>
-        <w:rPr>
-          <w:rFonts w:eastAsia="Times New Roman"/>
-        </w:rPr>
-        <w:t>hmic fairness audit, ensuring the system does not reproduce historical biases related to gender, age, or origin</w:t>
+        <w:t>A critical component of this processing is the algorithmic fairness audit, ensuring the system does not reproduce historical biases related to gender, age, or origin</w:t>
       </w:r>
     </w:p>
     <w:p>
@@ -581,13 +563,7 @@
         <w:rPr>
           <w:rFonts w:eastAsia="Times New Roman"/>
         </w:rPr>
-        <w:t>As the entity determining the "p</w:t>
-      </w:r>
-      <w:r>
-        <w:rPr>
-          <w:rFonts w:eastAsia="Times New Roman"/>
-        </w:rPr>
-        <w:t>urposes and means," the Controller bears primary liability.</w:t>
+        <w:t>As the entity determining the "purposes and means," the Controller bears primary liability.</w:t>
       </w:r>
     </w:p>
     <w:p>
@@ -665,13 +641,7 @@
         <w:rPr>
           <w:rFonts w:eastAsia="Times New Roman"/>
         </w:rPr>
-        <w:t>Manag</w:t>
-      </w:r>
-      <w:r>
-        <w:rPr>
-          <w:rFonts w:eastAsia="Times New Roman"/>
-        </w:rPr>
-        <w:t>ing Data Subject Rights (e.g., providing an explanation to a rejected candidate).</w:t>
+        <w:t>Managing Data Subject Rights (e.g., providing an explanation to a rejected candidate).</w:t>
       </w:r>
     </w:p>
     <w:p>
@@ -733,13 +703,7 @@
           <w:rFonts w:eastAsia="Times New Roman"/>
         </w:rPr>
         <w:br/>
-        <w:t>And other Testers who used RecruitSmart across a group of companies</w:t>
-      </w:r>
-      <w:r>
-        <w:rPr>
-          <w:rFonts w:eastAsia="Times New Roman"/>
-        </w:rPr>
-        <w:t xml:space="preserve"> where the global AI ethics policy was defined.</w:t>
+        <w:t>And other Testers who used RecruitSmart across a group of companies where the global AI ethics policy was defined.</w:t>
       </w:r>
     </w:p>
     <w:p>
@@ -802,13 +766,7 @@
         <w:rPr>
           <w:rFonts w:eastAsia="Times New Roman"/>
         </w:rPr>
-        <w:t>This is the vendor providing the API or the clo</w:t>
-      </w:r>
-      <w:r>
-        <w:rPr>
-          <w:rFonts w:eastAsia="Times New Roman"/>
-        </w:rPr>
-        <w:t>ud infrastructure.</w:t>
+        <w:t>This is the vendor providing the API or the cloud infrastructure.</w:t>
       </w:r>
     </w:p>
     <w:p>
@@ -893,13 +851,7 @@
         <w:rPr>
           <w:rFonts w:eastAsia="Times New Roman"/>
         </w:rPr>
-        <w:t>Notifying the Controller of any dat</w:t>
-      </w:r>
-      <w:r>
-        <w:rPr>
-          <w:rFonts w:eastAsia="Times New Roman"/>
-        </w:rPr>
-        <w:t>a breaches within 72 hours.</w:t>
+        <w:t>Notifying the Controller of any data breaches within 72 hours.</w:t>
       </w:r>
     </w:p>
     <w:p>
@@ -960,13 +912,7 @@
           <w:rFonts w:eastAsia="Times New Roman"/>
         </w:rPr>
         <w:br/>
-        <w:t>Key Responsibility: Providing the physical/virtual servers where the CV data is stored. Reviewed and confirmed vet</w:t>
-      </w:r>
-      <w:r>
-        <w:rPr>
-          <w:rFonts w:eastAsia="Times New Roman"/>
-        </w:rPr>
-        <w:t>ted for Data Residency (keeping the data within the EU/EEA to please the CNIL's international transfer rules).</w:t>
+        <w:t>Key Responsibility: Providing the physical/virtual servers where the CV data is stored. Reviewed and confirmed vetted for Data Residency (keeping the data within the EU/EEA to please the CNIL's international transfer rules).</w:t>
       </w:r>
       <w:r>
         <w:rPr>
@@ -991,13 +937,7 @@
         <w:rPr>
           <w:rFonts w:eastAsia="Times New Roman"/>
         </w:rPr>
-        <w:t xml:space="preserve">: Responsible for the periodic bias-testing of the RecruitSmart model. They act as the bridge between the DPO </w:t>
-      </w:r>
-      <w:r>
-        <w:rPr>
-          <w:rFonts w:eastAsia="Times New Roman"/>
-        </w:rPr>
-        <w:t>(Data Protection Officer) and the technical team to ensure "Privacy by Design."</w:t>
+        <w:t>: Responsible for the periodic bias-testing of the RecruitSmart model. They act as the bridge between the DPO (Data Protection Officer) and the technical team to ensure "Privacy by Design."</w:t>
       </w:r>
     </w:p>
     <w:p>
@@ -1157,13 +1097,7 @@
         <w:rPr>
           <w:rFonts w:eastAsia="Times New Roman"/>
         </w:rPr>
-        <w:t>The Cloud Infrastructure Se</w:t>
-      </w:r>
-      <w:r>
-        <w:rPr>
-          <w:rFonts w:eastAsia="Times New Roman"/>
-        </w:rPr>
-        <w:t>rvice Providers (CISPE) Code of Conduct: </w:t>
+        <w:t>The Cloud Infrastructure Service Providers (CISPE) Code of Conduct: </w:t>
       </w:r>
     </w:p>
     <w:p>
@@ -1289,34 +1223,16 @@
         <w:rPr>
           <w:rStyle w:val="Strong"/>
         </w:rPr>
-        <w:t>Evaluation : Acceptabl</w:t>
+        <w:t>Evaluation : Acceptable</w:t>
+      </w:r>
+      <w:r>
+        <w:br/>
       </w:r>
       <w:r>
         <w:rPr>
           <w:rStyle w:val="Strong"/>
         </w:rPr>
-        <w:t>e</w:t>
-      </w:r>
-      <w:r>
-        <w:br/>
-      </w:r>
-      <w:r>
-        <w:rPr>
-          <w:rStyle w:val="Strong"/>
-        </w:rPr>
-        <w:t>Evaluation c</w:t>
-      </w:r>
-      <w:r>
-        <w:rPr>
-          <w:rStyle w:val="Strong"/>
-        </w:rPr>
-        <w:t xml:space="preserve">omment </w:t>
-      </w:r>
-      <w:r>
-        <w:rPr>
-          <w:rStyle w:val="Strong"/>
-        </w:rPr>
-        <w:t>:</w:t>
+        <w:t>Evaluation comment :</w:t>
       </w:r>
       <w:r>
         <w:rPr>
@@ -1366,13 +1282,7 @@
         <w:rPr>
           <w:rFonts w:eastAsia="Times New Roman"/>
         </w:rPr>
-        <w:t>Risk Level Statement: "After implementing th</w:t>
-      </w:r>
-      <w:r>
-        <w:rPr>
-          <w:rFonts w:eastAsia="Times New Roman"/>
-        </w:rPr>
-        <w:t>e Redaction Engine and RBAC controls, the residual risk of illegitimate access is considered Acceptable (Medium)." </w:t>
+        <w:t>Risk Level Statement: "After implementing the Redaction Engine and RBAC controls, the residual risk of illegitimate access is considered Acceptable (Medium)." </w:t>
       </w:r>
     </w:p>
     <w:p>
@@ -1400,13 +1310,7 @@
         <w:rPr>
           <w:rFonts w:eastAsia="Times New Roman"/>
         </w:rPr>
-        <w:t>Justification: "The severity is mitigated by Pseudonymization—even in a breach, match-scores cannot be linked to individuals without the m</w:t>
-      </w:r>
-      <w:r>
-        <w:rPr>
-          <w:rFonts w:eastAsia="Times New Roman"/>
-        </w:rPr>
-        <w:t>aster key. The likelihood is lowered by MFA and IP Whitelisting." </w:t>
+        <w:t>Justification: "The severity is mitigated by Pseudonymization—even in a breach, match-scores cannot be linked to individuals without the master key. The likelihood is lowered by MFA and IP Whitelisting." </w:t>
       </w:r>
     </w:p>
     <w:p>
@@ -1462,13 +1366,7 @@
         <w:rPr>
           <w:rFonts w:eastAsia="Times New Roman"/>
         </w:rPr>
-        <w:t xml:space="preserve">Human-in-the-Loop Confirmation: "The AI system is </w:t>
-      </w:r>
-      <w:r>
-        <w:rPr>
-          <w:rFonts w:eastAsia="Times New Roman"/>
-        </w:rPr>
-        <w:t>strictly a decision-support tool; no candidate is automatically rejected. Final hiring decisions are always made by a human recruiter." </w:t>
+        <w:t>Human-in-the-Loop Confirmation: "The AI system is strictly a decision-support tool; no candidate is automatically rejected. Final hiring decisions are always made by a human recruiter." </w:t>
       </w:r>
     </w:p>
     <w:p>
@@ -1538,13 +1436,7 @@
         <w:rPr>
           <w:rFonts w:eastAsia="Times New Roman"/>
         </w:rPr>
-        <w:t>If any section was marked as "Improvabl</w:t>
-      </w:r>
-      <w:r>
-        <w:rPr>
-          <w:rFonts w:eastAsia="Times New Roman"/>
-        </w:rPr>
-        <w:t>e," you must attach a specific task. </w:t>
+        <w:t>If any section was marked as "Improvable," you must attach a specific task. </w:t>
       </w:r>
     </w:p>
     <w:p>
@@ -1594,13 +1486,7 @@
         <w:rPr>
           <w:rFonts w:eastAsia="Times New Roman"/>
         </w:rPr>
-        <w:t xml:space="preserve">Action 2: "Provide 'Algorithmic Literacy' </w:t>
-      </w:r>
-      <w:r>
-        <w:rPr>
-          <w:rFonts w:eastAsia="Times New Roman"/>
-        </w:rPr>
-        <w:t>training to all HR staff by Q3 to ensure correct interpretation of AI match-scores." </w:t>
+        <w:t>Action 2: "Provide 'Algorithmic Literacy' training to all HR staff by Q3 to ensure correct interpretation of AI match-scores." </w:t>
       </w:r>
     </w:p>
     <w:p>
@@ -1664,13 +1550,7 @@
         <w:rPr>
           <w:rFonts w:eastAsia="Times New Roman"/>
         </w:rPr>
-        <w:t>DPO Opinion: State that the</w:t>
-      </w:r>
-      <w:r>
-        <w:rPr>
-          <w:rFonts w:eastAsia="Times New Roman"/>
-        </w:rPr>
-        <w:t xml:space="preserve"> Data Protection Officer has reviewed the Legal Basis (Legitimate Interest) and finds it proportionate. </w:t>
+        <w:t>DPO Opinion: State that the Data Protection Officer has reviewed the Legal Basis (Legitimate Interest) and finds it proportionate. </w:t>
       </w:r>
     </w:p>
     <w:p>
@@ -1712,13 +1592,7 @@
         <w:rPr>
           <w:rFonts w:eastAsia="Times New Roman"/>
         </w:rPr>
-        <w:t>Final Ste</w:t>
-      </w:r>
-      <w:r>
-        <w:rPr>
-          <w:rFonts w:eastAsia="Times New Roman"/>
-        </w:rPr>
-        <w:t>p: Once you enter these, click "Ask for Validation" in the sidebar. This locks the version and prepares the official PDF report</w:t>
+        <w:t>Final Step: Once you enter these, click "Ask for Validation" in the sidebar. This locks the version and prepares the official PDF report</w:t>
       </w:r>
     </w:p>
     <w:p>
@@ -1794,14 +1668,7 @@
           <w:rStyle w:val="Strong"/>
           <w:rFonts w:eastAsia="Times New Roman"/>
         </w:rPr>
-        <w:t>Section 2.1: Data Categories, Recipients, and Reten</w:t>
-      </w:r>
-      <w:r>
-        <w:rPr>
-          <w:rStyle w:val="Strong"/>
-          <w:rFonts w:eastAsia="Times New Roman"/>
-        </w:rPr>
-        <w:t>tion</w:t>
+        <w:t>Section 2.1: Data Categories, Recipients, and Retention</w:t>
       </w:r>
     </w:p>
     <w:tbl>
@@ -1854,13 +1721,7 @@
               <w:rPr>
                 <w:rFonts w:eastAsia="Times New Roman"/>
               </w:rPr>
-              <w:t>Data Category</w:t>
-            </w:r>
-            <w:r>
-              <w:rPr>
-                <w:rFonts w:eastAsia="Times New Roman"/>
-              </w:rPr>
-              <w:t xml:space="preserve"> </w:t>
+              <w:t xml:space="preserve">Data Category </w:t>
             </w:r>
           </w:p>
         </w:tc>
@@ -2133,13 +1994,7 @@
               <w:rPr>
                 <w:rFonts w:eastAsia="Times New Roman"/>
               </w:rPr>
-              <w:t>2 years after last conta</w:t>
-            </w:r>
-            <w:r>
-              <w:rPr>
-                <w:rFonts w:eastAsia="Times New Roman"/>
-              </w:rPr>
-              <w:t>ct.</w:t>
+              <w:t>2 years after last contact.</w:t>
             </w:r>
           </w:p>
         </w:tc>
@@ -2505,13 +2360,7 @@
         <w:rPr>
           <w:rFonts w:eastAsia="Times New Roman"/>
         </w:rPr>
-        <w:t>Data enters the sys</w:t>
-      </w:r>
-      <w:r>
-        <w:rPr>
-          <w:rFonts w:eastAsia="Times New Roman"/>
-        </w:rPr>
-        <w:t>tem via the company’s career portal.</w:t>
+        <w:t>Data enters the system via the company’s career portal.</w:t>
       </w:r>
     </w:p>
     <w:p>
@@ -2540,13 +2389,7 @@
         <w:rPr>
           <w:rFonts w:eastAsia="Times New Roman"/>
         </w:rPr>
-        <w:t xml:space="preserve">Key "Recommendable" Feature: Technical Pre-filtering. Before the AI processes the document, a "Sanitization Script" identifies and masks sensitive data points </w:t>
-      </w:r>
-      <w:r>
-        <w:rPr>
-          <w:rFonts w:eastAsia="Times New Roman"/>
-        </w:rPr>
-        <w:t xml:space="preserve">(e.g., photos, birth dates, or </w:t>
+        <w:t xml:space="preserve">Key "Recommendable" Feature: Technical Pre-filtering. Before the AI processes the document, a "Sanitization Script" identifies and masks sensitive data points (e.g., photos, birth dates, or </w:t>
       </w:r>
       <w:r>
         <w:rPr>
@@ -2603,13 +2446,7 @@
         <w:rPr>
           <w:rFonts w:eastAsia="Times New Roman"/>
         </w:rPr>
-        <w:t>The Pro</w:t>
-      </w:r>
-      <w:r>
-        <w:rPr>
-          <w:rFonts w:eastAsia="Times New Roman"/>
-        </w:rPr>
-        <w:t>cess: The Natural Language Processing (NLP) engine breaks down the CV into "tokens" (keywords like "Python," "Project Management," "Bachelor's Degree"). These tokens are compared against the job's "Target Profile."</w:t>
+        <w:t>The Process: The Natural Language Processing (NLP) engine breaks down the CV into "tokens" (keywords like "Python," "Project Management," "Bachelor's Degree"). These tokens are compared against the job's "Target Profile."</w:t>
       </w:r>
     </w:p>
     <w:p>
@@ -2624,13 +2461,7 @@
         <w:rPr>
           <w:rFonts w:eastAsia="Times New Roman"/>
         </w:rPr>
-        <w:t>Key "Recommendable" Feature: Local Infe</w:t>
-      </w:r>
-      <w:r>
-        <w:rPr>
-          <w:rFonts w:eastAsia="Times New Roman"/>
-        </w:rPr>
-        <w:t>rence. The data is processed within a Sovereign Cloud (e.g., a localized instance in the EU). We avoid "Global Training Loops" where candidate data is sent back to a vendor to train their general model.</w:t>
+        <w:t>Key "Recommendable" Feature: Local Inference. The data is processed within a Sovereign Cloud (e.g., a localized instance in the EU). We avoid "Global Training Loops" where candidate data is sent back to a vendor to train their general model.</w:t>
       </w:r>
     </w:p>
     <w:p>
@@ -2665,13 +2496,7 @@
         <w:rPr>
           <w:rFonts w:eastAsia="Times New Roman"/>
         </w:rPr>
-        <w:t>Once processed, t</w:t>
-      </w:r>
-      <w:r>
-        <w:rPr>
-          <w:rFonts w:eastAsia="Times New Roman"/>
-        </w:rPr>
-        <w:t>he data is stored for HR review.</w:t>
+        <w:t>Once processed, the data is stored for HR review.</w:t>
       </w:r>
     </w:p>
     <w:p>
@@ -2700,13 +2525,7 @@
         <w:rPr>
           <w:rFonts w:eastAsia="Times New Roman"/>
         </w:rPr>
-        <w:t xml:space="preserve">Key "Recommendable" Feature: Role-Based Access Control (RBAC). The AI-generated "Match Score" is visible to recruiters, but the raw, unredacted </w:t>
-      </w:r>
-      <w:r>
-        <w:rPr>
-          <w:rFonts w:eastAsia="Times New Roman"/>
-        </w:rPr>
-        <w:t>CV is only accessible to the specific hiring manager for that role. This limits the "blast radius" of any internal data misuse.</w:t>
+        <w:t>Key "Recommendable" Feature: Role-Based Access Control (RBAC). The AI-generated "Match Score" is visible to recruiters, but the raw, unredacted CV is only accessible to the specific hiring manager for that role. This limits the "blast radius" of any internal data misuse.</w:t>
       </w:r>
       <w:r>
         <w:rPr>
@@ -2774,13 +2593,7 @@
         <w:rPr>
           <w:rFonts w:eastAsia="Times New Roman"/>
         </w:rPr>
-        <w:t>Key "Recommendable" Feature: The Override Log. Every time a human ignores the AI’s recommend</w:t>
-      </w:r>
-      <w:r>
-        <w:rPr>
-          <w:rFonts w:eastAsia="Times New Roman"/>
-        </w:rPr>
-        <w:t>ation (e.g., interviewing a "low-score" candidate), the system logs the reason. This creates a "Fairness Audit Trail" which the CNIL highly recommends for Algorithmic Accountability.</w:t>
+        <w:t>Key "Recommendable" Feature: The Override Log. Every time a human ignores the AI’s recommendation (e.g., interviewing a "low-score" candidate), the system logs the reason. This creates a "Fairness Audit Trail" which the CNIL highly recommends for Algorithmic Accountability.</w:t>
       </w:r>
     </w:p>
     <w:p>
@@ -2815,13 +2628,7 @@
         <w:rPr>
           <w:rFonts w:eastAsia="Times New Roman"/>
         </w:rPr>
-        <w:t>The data lifecycle ends when th</w:t>
-      </w:r>
-      <w:r>
-        <w:rPr>
-          <w:rFonts w:eastAsia="Times New Roman"/>
-        </w:rPr>
-        <w:t>e purpose is fulfilled.</w:t>
+        <w:t>The data lifecycle ends when the purpose is fulfilled.</w:t>
       </w:r>
     </w:p>
     <w:p>
@@ -2849,13 +2656,7 @@
         <w:rPr>
           <w:rFonts w:eastAsia="Times New Roman"/>
         </w:rPr>
-        <w:t>Key "Recommendable" Feature: Automated Cryptographic Erasure. At the 2-year mark, t</w:t>
-      </w:r>
-      <w:r>
-        <w:rPr>
-          <w:rFonts w:eastAsia="Times New Roman"/>
-        </w:rPr>
-        <w:t>he system doesn't just "delete" the entry; it destroys the unique encryption key for that candidate’s record. This makes the data unrecoverable, satisfying the Right to be Forgotten (Art. 17 GDPR).</w:t>
+        <w:t>Key "Recommendable" Feature: Automated Cryptographic Erasure. At the 2-year mark, the system doesn't just "delete" the entry; it destroys the unique encryption key for that candidate’s record. This makes the data unrecoverable, satisfying the Right to be Forgotten (Art. 17 GDPR).</w:t>
       </w:r>
     </w:p>
     <w:p>
@@ -2926,13 +2727,7 @@
               <w:rPr>
                 <w:rFonts w:eastAsia="Times New Roman"/>
               </w:rPr>
-              <w:t>Specif</w:t>
-            </w:r>
-            <w:r>
-              <w:rPr>
-                <w:rFonts w:eastAsia="Times New Roman"/>
-              </w:rPr>
-              <w:t>ic Supporting Assets</w:t>
+              <w:t>Specific Supporting Assets</w:t>
             </w:r>
           </w:p>
         </w:tc>
@@ -3085,13 +2880,7 @@
               <w:rPr>
                 <w:rFonts w:eastAsia="Times New Roman"/>
               </w:rPr>
-              <w:t>The secure OS environment where the AI scri</w:t>
-            </w:r>
-            <w:r>
-              <w:rPr>
-                <w:rFonts w:eastAsia="Times New Roman"/>
-              </w:rPr>
-              <w:t>pts run.</w:t>
+              <w:t>The secure OS environment where the AI scripts run.</w:t>
             </w:r>
           </w:p>
         </w:tc>
@@ -3358,13 +3147,7 @@
               <w:rPr>
                 <w:rFonts w:eastAsia="Times New Roman"/>
               </w:rPr>
-              <w:t xml:space="preserve">Manages the </w:t>
-            </w:r>
-            <w:r>
-              <w:rPr>
-                <w:rFonts w:eastAsia="Times New Roman"/>
-              </w:rPr>
-              <w:t>Encryption Keys and infrastructure-as-code configurations.</w:t>
+              <w:t>Manages the Encryption Keys and infrastructure-as-code configurations.</w:t>
             </w:r>
           </w:p>
         </w:tc>
@@ -3588,11 +3371,6 @@
           <w:rFonts w:eastAsia="Times New Roman"/>
         </w:rPr>
         <w:br/>
-      </w:r>
-      <w:r>
-        <w:rPr>
-          <w:rFonts w:eastAsia="Times New Roman"/>
-        </w:rPr>
         <w:t>We do not use a vague term like "improving HR." We break it down into precise sub-purposes:</w:t>
       </w:r>
     </w:p>
@@ -3664,13 +3442,7 @@
         <w:rPr>
           <w:rFonts w:eastAsia="Times New Roman"/>
         </w:rPr>
-        <w:t>: Retention of candidate dat</w:t>
-      </w:r>
-      <w:r>
-        <w:rPr>
-          <w:rFonts w:eastAsia="Times New Roman"/>
-        </w:rPr>
-        <w:t>a for the duration of the legal prescription period (2 years) to defend against potential discrimination claims.</w:t>
+        <w:t>: Retention of candidate data for the duration of the legal prescription period (2 years) to defend against potential discrimination claims.</w:t>
       </w:r>
     </w:p>
     <w:p>
@@ -3720,13 +3492,7 @@
         <w:rPr>
           <w:rFonts w:eastAsia="Times New Roman"/>
         </w:rPr>
-        <w:t xml:space="preserve">Transparency: Candidates are informed via a </w:t>
-      </w:r>
-      <w:r>
-        <w:rPr>
-          <w:rFonts w:eastAsia="Times New Roman"/>
-        </w:rPr>
-        <w:t>Privacy Notice on the upload portal before they submit their CV.</w:t>
+        <w:t>Transparency: Candidates are informed via a Privacy Notice on the upload portal before they submit their CV.</w:t>
       </w:r>
     </w:p>
     <w:p>
@@ -3748,13 +3514,7 @@
         <w:rPr>
           <w:rFonts w:eastAsia="Times New Roman"/>
         </w:rPr>
-        <w:t>: The notice explicitly states: "Your CV will be analyzed by an AI tool to assist our recruiters in identifying relevant skills. A human recruiter makes all final interview decisions</w:t>
-      </w:r>
-      <w:r>
-        <w:rPr>
-          <w:rFonts w:eastAsia="Times New Roman"/>
-        </w:rPr>
-        <w:t>."</w:t>
+        <w:t>: The notice explicitly states: "Your CV will be analyzed by an AI tool to assist our recruiters in identifying relevant skills. A human recruiter makes all final interview decisions."</w:t>
       </w:r>
     </w:p>
     <w:p>
@@ -3812,13 +3572,7 @@
         <w:rPr>
           <w:rFonts w:eastAsia="Times New Roman"/>
         </w:rPr>
-        <w:t>The processing is balanced against the rights of t</w:t>
-      </w:r>
-      <w:r>
-        <w:rPr>
-          <w:rFonts w:eastAsia="Times New Roman"/>
-        </w:rPr>
-        <w:t>he candidates.</w:t>
+        <w:t>The processing is balanced against the rights of the candidates.</w:t>
       </w:r>
     </w:p>
     <w:p>
@@ -3846,19 +3600,7 @@
         <w:rPr>
           <w:rFonts w:eastAsia="Times New Roman"/>
         </w:rPr>
-        <w:t>The "Legitimacy Test": The processi</w:t>
-      </w:r>
-      <w:r>
-        <w:rPr>
-          <w:rFonts w:eastAsia="Times New Roman"/>
-        </w:rPr>
-        <w:t>ng is legitimate because it focuses strictly on professional data (skills/experience) and excludes sensitive data (religion, health, etc.). By using the Redaction Engine shown in our diagram, we ensure the "legitimate interest" of the company does not over</w:t>
-      </w:r>
-      <w:r>
-        <w:rPr>
-          <w:rFonts w:eastAsia="Times New Roman"/>
-        </w:rPr>
-        <w:t>ride the candidate's right to privacy.</w:t>
+        <w:t>The "Legitimacy Test": The processing is legitimate because it focuses strictly on professional data (skills/experience) and excludes sensitive data (religion, health, etc.). By using the Redaction Engine shown in our diagram, we ensure the "legitimate interest" of the company does not override the candidate's right to privacy.</w:t>
       </w:r>
     </w:p>
     <w:p>
@@ -3945,13 +3687,7 @@
         <w:rPr>
           <w:rFonts w:eastAsia="Times New Roman"/>
         </w:rPr>
-        <w:t>Legal Basis: Necessary for the performance of a contract or to tak</w:t>
-      </w:r>
-      <w:r>
-        <w:rPr>
-          <w:rFonts w:eastAsia="Times New Roman"/>
-        </w:rPr>
-        <w:t>e steps at the request of the data subject prior to entering into a contract (Art. 6.1.b GDPR).</w:t>
+        <w:t>Legal Basis: Necessary for the performance of a contract or to take steps at the request of the data subject prior to entering into a contract (Art. 6.1.b GDPR).</w:t>
       </w:r>
     </w:p>
     <w:p>
@@ -3972,13 +3708,7 @@
         <w:rPr>
           <w:rFonts w:eastAsia="Times New Roman"/>
         </w:rPr>
-        <w:t>: When a candidate applies via our portal, processing their CV is a necessary step to evaluate their application for a potential employment contrac</w:t>
-      </w:r>
-      <w:r>
-        <w:rPr>
-          <w:rFonts w:eastAsia="Times New Roman"/>
-        </w:rPr>
-        <w:t>t. </w:t>
+        <w:t>: When a candidate applies via our portal, processing their CV is a necessary step to evaluate their application for a potential employment contract. </w:t>
       </w:r>
     </w:p>
     <w:p>
@@ -4071,13 +3801,7 @@
         <w:rPr>
           <w:rFonts w:eastAsia="Times New Roman"/>
         </w:rPr>
-        <w:t xml:space="preserve">Recruitment Efficiency: The company has a legitimate interest in </w:t>
-      </w:r>
-      <w:r>
-        <w:rPr>
-          <w:rFonts w:eastAsia="Times New Roman"/>
-        </w:rPr>
-        <w:t>using AI to manage high volumes of applications effectively.</w:t>
+        <w:t>Recruitment Efficiency: The company has a legitimate interest in using AI to manage high volumes of applications effectively.</w:t>
       </w:r>
     </w:p>
     <w:p>
@@ -4091,13 +3815,7 @@
         <w:rPr>
           <w:rFonts w:eastAsia="Times New Roman"/>
         </w:rPr>
-        <w:t xml:space="preserve">Fairness Audits: You have a legitimate interest in analyzing "Match Scores" to ensure the model is not biased. The CNIL specifically recommends legitimate interest over consent for diversity and </w:t>
-      </w:r>
-      <w:r>
-        <w:rPr>
-          <w:rFonts w:eastAsia="Times New Roman"/>
-        </w:rPr>
-        <w:t>fairness monitoring because it avoids the power imbalance inherent in hiring. </w:t>
+        <w:t>Fairness Audits: You have a legitimate interest in analyzing "Match Scores" to ensure the model is not biased. The CNIL specifically recommends legitimate interest over consent for diversity and fairness monitoring because it avoids the power imbalance inherent in hiring. </w:t>
       </w:r>
     </w:p>
     <w:p>
@@ -4146,13 +3864,7 @@
         <w:rPr>
           <w:rFonts w:eastAsia="Times New Roman"/>
         </w:rPr>
-        <w:t>Legal Basis: Necessary for compliance with a legal obligation (Art. 6.1.c GDPR). Application: In France, recruiters must retain records to prove compliance with non-discrimination laws (Labour Code). The CNIL recommends a 2-year retention period specifical</w:t>
-      </w:r>
-      <w:r>
-        <w:rPr>
-          <w:rFonts w:eastAsia="Times New Roman"/>
-        </w:rPr>
-        <w:t>ly to meet these legal defense requirements. </w:t>
+        <w:t>Legal Basis: Necessary for compliance with a legal obligation (Art. 6.1.c GDPR). Application: In France, recruiters must retain records to prove compliance with non-discrimination laws (Labour Code). The CNIL recommends a 2-year retention period specifically to meet these legal defense requirements. </w:t>
       </w:r>
     </w:p>
     <w:p>
@@ -4222,13 +3934,7 @@
           <w:rFonts w:eastAsia="Times New Roman"/>
         </w:rPr>
         <w:lastRenderedPageBreak/>
-        <w:t>Application: If you wish to keep a candidate's CV for f</w:t>
-      </w:r>
-      <w:r>
-        <w:rPr>
-          <w:rFonts w:eastAsia="Times New Roman"/>
-        </w:rPr>
-        <w:t>uture job openings beyond the specific role they applied for, you must obtain their explicit, opt-in consent. </w:t>
+        <w:t>Application: If you wish to keep a candidate's CV for future job openings beyond the specific role they applied for, you must obtain their explicit, opt-in consent. </w:t>
       </w:r>
     </w:p>
     <w:p>
@@ -4257,13 +3963,7 @@
         <w:rPr>
           <w:rFonts w:eastAsia="Times New Roman"/>
         </w:rPr>
-        <w:t>Are the data collected adequate, relevant and limited to what is necessary in relation to the purposes for which they are processed ('data mini</w:t>
-      </w:r>
-      <w:r>
-        <w:rPr>
-          <w:rFonts w:eastAsia="Times New Roman"/>
-        </w:rPr>
-        <w:t>misation')?</w:t>
+        <w:t>Are the data collected adequate, relevant and limited to what is necessary in relation to the purposes for which they are processed ('data minimisation')?</w:t>
       </w:r>
     </w:p>
     <w:p>
@@ -4279,14 +3979,7 @@
           <w:rStyle w:val="Emphasis"/>
           <w:rFonts w:eastAsia="Times New Roman"/>
         </w:rPr>
-        <w:t xml:space="preserve">"Data minimisation is achieved through an automated pre-processing layer that filters out non-professional attributes. By isolating 'Professional Tokens' (Skills/Experience) from 'Identity Attributes' (Name/Gender), the RecruitSmart AI ensures </w:t>
-      </w:r>
-      <w:r>
-        <w:rPr>
-          <w:rStyle w:val="Emphasis"/>
-          <w:rFonts w:eastAsia="Times New Roman"/>
-        </w:rPr>
-        <w:t>that the processing is strictly limited to data that is objectively relevant to the job description, thereby reducing the risk of discriminatory output.</w:t>
+        <w:t>"Data minimisation is achieved through an automated pre-processing layer that filters out non-professional attributes. By isolating 'Professional Tokens' (Skills/Experience) from 'Identity Attributes' (Name/Gender), the RecruitSmart AI ensures that the processing is strictly limited to data that is objectively relevant to the job description, thereby reducing the risk of discriminatory output.</w:t>
       </w:r>
     </w:p>
     <w:tbl>
@@ -4350,14 +4043,7 @@
                 <w:rStyle w:val="Strong"/>
                 <w:rFonts w:eastAsia="Times New Roman"/>
               </w:rPr>
-              <w:t>Section 2.4: Data Minimisation &amp; Relevance</w:t>
-            </w:r>
-            <w:r>
-              <w:rPr>
-                <w:rStyle w:val="Strong"/>
-                <w:rFonts w:eastAsia="Times New Roman"/>
-              </w:rPr>
-              <w:t xml:space="preserve"> </w:t>
+              <w:t xml:space="preserve">Section 2.4: Data Minimisation &amp; Relevance </w:t>
             </w:r>
           </w:p>
         </w:tc>
@@ -5680,13 +5366,7 @@
               <w:rPr>
                 <w:rFonts w:eastAsia="Times New Roman"/>
               </w:rPr>
-              <w:t>Limited to validated keywords (e.g., "P</w:t>
-            </w:r>
-            <w:r>
-              <w:rPr>
-                <w:rFonts w:eastAsia="Times New Roman"/>
-              </w:rPr>
-              <w:t>ython," "Project Management") found in the CV.</w:t>
+              <w:t>Limited to validated keywords (e.g., "Python," "Project Management") found in the CV.</w:t>
             </w:r>
           </w:p>
         </w:tc>
@@ -6235,13 +5915,7 @@
         <w:rPr>
           <w:rFonts w:eastAsia="Times New Roman"/>
         </w:rPr>
-        <w:t>Data accuracy is guaranteed through a 'Candidate-in-the-loop' validation step where applicants review and confirm the AI’s data extraction. Furthermore, the NLP model undergoes bi-monthly 'Accuracy Benchmarking' against human-annotated datasets to ensure t</w:t>
-      </w:r>
-      <w:r>
-        <w:rPr>
-          <w:rFonts w:eastAsia="Times New Roman"/>
-        </w:rPr>
-        <w:t>hat the parsing logic remains aligned with modern recruitment terminology and formatting.</w:t>
+        <w:t>Data accuracy is guaranteed through a 'Candidate-in-the-loop' validation step where applicants review and confirm the AI’s data extraction. Furthermore, the NLP model undergoes bi-monthly 'Accuracy Benchmarking' against human-annotated datasets to ensure that the parsing logic remains aligned with modern recruitment terminology and formatting.</w:t>
       </w:r>
     </w:p>
     <w:tbl>
@@ -6726,13 +6400,7 @@
               <w:rPr>
                 <w:rFonts w:eastAsia="Times New Roman"/>
               </w:rPr>
-              <w:t>The "Review &amp; Edit" Screen: After u</w:t>
-            </w:r>
-            <w:r>
-              <w:rPr>
-                <w:rFonts w:eastAsia="Times New Roman"/>
-              </w:rPr>
-              <w:t>ploading, the system shows the candidate the extracted data points.</w:t>
+              <w:t>The "Review &amp; Edit" Screen: After uploading, the system shows the candidate the extracted data points.</w:t>
             </w:r>
           </w:p>
         </w:tc>
@@ -6818,13 +6486,7 @@
               <w:rPr>
                 <w:rFonts w:eastAsia="Times New Roman"/>
               </w:rPr>
-              <w:t>Ens</w:t>
-            </w:r>
-            <w:r>
-              <w:rPr>
-                <w:rFonts w:eastAsia="Times New Roman"/>
-              </w:rPr>
-              <w:t>ures the AI isn't scoring candidates against outdated or "stale" job requirements.</w:t>
+              <w:t>Ensures the AI isn't scoring candidates against outdated or "stale" job requirements.</w:t>
             </w:r>
           </w:p>
         </w:tc>
@@ -6857,13 +6519,7 @@
         <w:rPr>
           <w:rFonts w:eastAsia="Times New Roman"/>
         </w:rPr>
-        <w:t>The storage durations are strictly aligned with the CNIL’s recruitment guidelines (2 years from the last contact). This period is legally justified by the necessity to maintain evidence in the event of a litigation regarding hiring bias. From a technical s</w:t>
-      </w:r>
-      <w:r>
-        <w:rPr>
-          <w:rFonts w:eastAsia="Times New Roman"/>
-        </w:rPr>
-        <w:t>tandpoint, the 2-year window allows for meaningful 'Back-testing' of the AI model's accuracy against actual employee performance</w:t>
+        <w:t>The storage durations are strictly aligned with the CNIL’s recruitment guidelines (2 years from the last contact). This period is legally justified by the necessity to maintain evidence in the event of a litigation regarding hiring bias. From a technical standpoint, the 2-year window allows for meaningful 'Back-testing' of the AI model's accuracy against actual employee performance</w:t>
       </w:r>
     </w:p>
     <w:tbl>
@@ -7054,13 +6710,7 @@
               <w:rPr>
                 <w:rFonts w:eastAsia="Times New Roman"/>
               </w:rPr>
-              <w:t xml:space="preserve">Legal &amp; </w:t>
-            </w:r>
-            <w:r>
-              <w:rPr>
-                <w:rFonts w:eastAsia="Times New Roman"/>
-              </w:rPr>
-              <w:t>Technical Justification</w:t>
+              <w:t>Legal &amp; Technical Justification</w:t>
             </w:r>
           </w:p>
         </w:tc>
@@ -7127,13 +6777,7 @@
               <w:rPr>
                 <w:rFonts w:eastAsia="Times New Roman"/>
               </w:rPr>
-              <w:t xml:space="preserve">Legal Requirement: Follows CNIL simplified standard NS-046. Justified by the need to defend against discrimination claims (Statute </w:t>
-            </w:r>
-            <w:r>
-              <w:rPr>
-                <w:rFonts w:eastAsia="Times New Roman"/>
-              </w:rPr>
-              <w:t>of limitations).</w:t>
+              <w:t>Legal Requirement: Follows CNIL simplified standard NS-046. Justified by the need to defend against discrimination claims (Statute of limitations).</w:t>
             </w:r>
           </w:p>
         </w:tc>
@@ -7293,13 +6937,7 @@
               <w:rPr>
                 <w:rFonts w:eastAsia="Times New Roman"/>
               </w:rPr>
-              <w:t>Tech</w:t>
-            </w:r>
-            <w:r>
-              <w:rPr>
-                <w:rFonts w:eastAsia="Times New Roman"/>
-              </w:rPr>
-              <w:t>nical Logs (IP, Connection timestamps)</w:t>
+              <w:t>Technical Logs (IP, Connection timestamps)</w:t>
             </w:r>
           </w:p>
         </w:tc>
@@ -7387,13 +7025,7 @@
         <w:rPr>
           <w:rFonts w:eastAsia="Times New Roman"/>
         </w:rPr>
-        <w:t>How are the data</w:t>
-      </w:r>
-      <w:r>
-        <w:rPr>
-          <w:rFonts w:eastAsia="Times New Roman"/>
-        </w:rPr>
-        <w:t xml:space="preserve"> subjects informed on the processing?</w:t>
+        <w:t>How are the data subjects informed on the processing?</w:t>
       </w:r>
     </w:p>
     <w:p>
@@ -7408,13 +7040,7 @@
         <w:rPr>
           <w:rFonts w:eastAsia="Times New Roman"/>
         </w:rPr>
-        <w:t>Transparency is ensured through a multi-layered notification system. Candidates are informed of the AI's role prior to data submission. The logic is explained in non-technical terms, focusing on the professional criter</w:t>
-      </w:r>
-      <w:r>
-        <w:rPr>
-          <w:rFonts w:eastAsia="Times New Roman"/>
-        </w:rPr>
-        <w:t>ia weighted by the model, thereby fulfilling the transparency requirements of Art. 22 without compromising the company's proprietary trade secrets</w:t>
+        <w:t>Transparency is ensured through a multi-layered notification system. Candidates are informed of the AI's role prior to data submission. The logic is explained in non-technical terms, focusing on the professional criteria weighted by the model, thereby fulfilling the transparency requirements of Art. 22 without compromising the company's proprietary trade secrets</w:t>
       </w:r>
     </w:p>
     <w:tbl>
@@ -7745,13 +7371,7 @@
               <w:rPr>
                 <w:rFonts w:eastAsia="Times New Roman"/>
               </w:rPr>
-              <w:t>Iden</w:t>
-            </w:r>
-            <w:r>
-              <w:rPr>
-                <w:rFonts w:eastAsia="Times New Roman"/>
-              </w:rPr>
-              <w:t>tity of the Controller, the use of AI for skill-scoring, and the "Human-in-the-loop" guarantee.</w:t>
+              <w:t>Identity of the Controller, the use of AI for skill-scoring, and the "Human-in-the-loop" guarantee.</w:t>
             </w:r>
           </w:p>
         </w:tc>
@@ -7884,13 +7504,7 @@
               <w:rPr>
                 <w:rFonts w:eastAsia="Times New Roman"/>
               </w:rPr>
-              <w:t>Explanation of the weighting criteria (e.g., "We prioritize yea</w:t>
-            </w:r>
-            <w:r>
-              <w:rPr>
-                <w:rFonts w:eastAsia="Times New Roman"/>
-              </w:rPr>
-              <w:t>rs of experience and specific technical certifications").</w:t>
+              <w:t>Explanation of the weighting criteria (e.g., "We prioritize years of experience and specific technical certifications").</w:t>
             </w:r>
           </w:p>
         </w:tc>
@@ -7953,13 +7567,7 @@
         <w:rPr>
           <w:rFonts w:eastAsia="Times New Roman"/>
         </w:rPr>
-        <w:t>: "An algorithmi</w:t>
-      </w:r>
-      <w:r>
-        <w:rPr>
-          <w:rFonts w:eastAsia="Times New Roman"/>
-        </w:rPr>
-        <w:t>c tool assists our recruiters by ranking applications based on professional qualifications."</w:t>
+        <w:t>: "An algorithmic tool assists our recruiters by ranking applications based on professional qualifications."</w:t>
       </w:r>
     </w:p>
     <w:p>
@@ -7982,13 +7590,7 @@
         <w:rPr>
           <w:rFonts w:eastAsia="Times New Roman"/>
         </w:rPr>
-        <w:t xml:space="preserve">: We describe the "Input Features" (Skills, Education, Tenure) without revealing the exact mathematical code (Trade Secret </w:t>
-      </w:r>
-      <w:r>
-        <w:rPr>
-          <w:rFonts w:eastAsia="Times New Roman"/>
-        </w:rPr>
-        <w:t>Protection).</w:t>
+        <w:t>: We describe the "Input Features" (Skills, Education, Tenure) without revealing the exact mathematical code (Trade Secret Protection).</w:t>
       </w:r>
     </w:p>
     <w:p>
@@ -8060,19 +7662,7 @@
         <w:rPr>
           <w:rFonts w:eastAsia="Times New Roman"/>
         </w:rPr>
-        <w:t>Consent is strictly limited to non-essential secondary purposes (e.g.</w:t>
-      </w:r>
-      <w:r>
-        <w:rPr>
-          <w:rFonts w:eastAsia="Times New Roman"/>
-        </w:rPr>
-        <w:t xml:space="preserve">, Talent Pool inclusion). Controls include a dedicated 'Consent Log' and a self-service portal for instantaneous withdrawal. We ensure that the refusal to provide consent for secondary processing has no technical impact on the AI's objective assessment of </w:t>
-      </w:r>
-      <w:r>
-        <w:rPr>
-          <w:rFonts w:eastAsia="Times New Roman"/>
-        </w:rPr>
-        <w:t>the candidate's professional qualifications.</w:t>
+        <w:t>Consent is strictly limited to non-essential secondary purposes (e.g., Talent Pool inclusion). Controls include a dedicated 'Consent Log' and a self-service portal for instantaneous withdrawal. We ensure that the refusal to provide consent for secondary processing has no technical impact on the AI's objective assessment of the candidate's professional qualifications.</w:t>
       </w:r>
     </w:p>
     <w:p>
@@ -8102,13 +7692,7 @@
         <w:rPr>
           <w:rFonts w:eastAsia="Times New Roman"/>
         </w:rPr>
-        <w:t>Consent is strictly limited to non-essential secondary purposes (e.g., Talent Pool inclusion). Controls include a dedicated 'Consent</w:t>
-      </w:r>
-      <w:r>
-        <w:rPr>
-          <w:rFonts w:eastAsia="Times New Roman"/>
-        </w:rPr>
-        <w:t xml:space="preserve"> Log' and a self-service portal for instantaneous withdrawal. We ensure that the refusal to provide consent for secondary processing has no technical impact on the AI's objective assessment of the candidate's professional qualifications."</w:t>
+        <w:t>Consent is strictly limited to non-essential secondary purposes (e.g., Talent Pool inclusion). Controls include a dedicated 'Consent Log' and a self-service portal for instantaneous withdrawal. We ensure that the refusal to provide consent for secondary processing has no technical impact on the AI's objective assessment of the candidate's professional qualifications."</w:t>
       </w:r>
     </w:p>
     <w:tbl>
@@ -8151,14 +7735,7 @@
                 <w:rStyle w:val="Strong"/>
                 <w:rFonts w:eastAsia="Times New Roman"/>
               </w:rPr>
-              <w:t>Section 2.8: Co</w:t>
-            </w:r>
-            <w:r>
-              <w:rPr>
-                <w:rStyle w:val="Strong"/>
-                <w:rFonts w:eastAsia="Times New Roman"/>
-              </w:rPr>
-              <w:t>nsent Management &amp; Control</w:t>
+              <w:t>Section 2.8: Consent Management &amp; Control</w:t>
             </w:r>
           </w:p>
         </w:tc>
@@ -9342,13 +8919,7 @@
         <w:rPr>
           <w:rFonts w:eastAsia="Times New Roman"/>
         </w:rPr>
-        <w:t>Granularity: Candidates</w:t>
-      </w:r>
-      <w:r>
-        <w:rPr>
-          <w:rFonts w:eastAsia="Times New Roman"/>
-        </w:rPr>
-        <w:t xml:space="preserve"> are not forced to "Accept All." They can consent to the Talent Pool but refuse "Future Marketing Emails."</w:t>
+        <w:t>Granularity: Candidates are not forced to "Accept All." They can consent to the Talent Pool but refuse "Future Marketing Emails."</w:t>
       </w:r>
     </w:p>
     <w:p>
@@ -9362,13 +8933,7 @@
         <w:rPr>
           <w:rFonts w:eastAsia="Times New Roman"/>
         </w:rPr>
-        <w:t xml:space="preserve">The "Withdrawal" Dashboard: Every candidate has an "Applicant Portal" where they can see their active consents and toggle them to "OFF" at any time. </w:t>
-      </w:r>
-      <w:r>
-        <w:rPr>
-          <w:rFonts w:eastAsia="Times New Roman"/>
-        </w:rPr>
-        <w:t>This fulfills the "as easy to withdraw as to give" requirement.</w:t>
+        <w:t>The "Withdrawal" Dashboard: Every candidate has an "Applicant Portal" where they can see their active consents and toggle them to "OFF" at any time. This fulfills the "as easy to withdraw as to give" requirement.</w:t>
       </w:r>
     </w:p>
     <w:p>
@@ -9413,13 +8978,7 @@
           <w:rFonts w:eastAsia="Times New Roman"/>
         </w:rPr>
         <w:br/>
-        <w:t>Why it's Recommendable: This pr</w:t>
-      </w:r>
-      <w:r>
-        <w:rPr>
-          <w:rFonts w:eastAsia="Times New Roman"/>
-        </w:rPr>
-        <w:t>ovides the Proof of Consent required during a CNIL audit without revealing the candidate's actual name to the audit team (pseudonymization).</w:t>
+        <w:t>Why it's Recommendable: This provides the Proof of Consent required during a CNIL audit without revealing the candidate's actual name to the audit team (pseudonymization).</w:t>
       </w:r>
     </w:p>
     <w:p>
@@ -9454,13 +9013,7 @@
         <w:rPr>
           <w:rFonts w:eastAsia="Times New Roman"/>
         </w:rPr>
-        <w:t>To ensure consent is truly "free," the system is programmed so that unchecking the Tale</w:t>
-      </w:r>
-      <w:r>
-        <w:rPr>
-          <w:rFonts w:eastAsia="Times New Roman"/>
-        </w:rPr>
-        <w:t>nt Pool box does not affect the AI "Match-Score" for the current application. The AI logic is completely decoupled from the consent status.</w:t>
+        <w:t>To ensure consent is truly "free," the system is programmed so that unchecking the Talent Pool box does not affect the AI "Match-Score" for the current application. The AI logic is completely decoupled from the consent status.</w:t>
       </w:r>
     </w:p>
     <w:p>
@@ -9489,13 +9042,7 @@
         <w:rPr>
           <w:rFonts w:eastAsia="Times New Roman"/>
         </w:rPr>
-        <w:t>The rights to rectification and erasure are operationalized via a self-service Applicant Portal. Rectification is integrated into the pre-processing phase to ensure algorithmic accur</w:t>
-      </w:r>
-      <w:r>
-        <w:rPr>
-          <w:rFonts w:eastAsia="Times New Roman"/>
-        </w:rPr>
-        <w:t>acy. Erasure is guaranteed through an automated 'Purge &amp; Shred' protocol that includes cryptographic key destruction and the immediate propagation of deletion requests to all downstream sub-processors</w:t>
+        <w:t>The rights to rectification and erasure are operationalized via a self-service Applicant Portal. Rectification is integrated into the pre-processing phase to ensure algorithmic accuracy. Erasure is guaranteed through an automated 'Purge &amp; Shred' protocol that includes cryptographic key destruction and the immediate propagation of deletion requests to all downstream sub-processors</w:t>
       </w:r>
     </w:p>
     <w:p>
@@ -9524,19 +9071,67 @@
           <w:rStyle w:val="Strong"/>
           <w:rFonts w:eastAsia="Times New Roman"/>
         </w:rPr>
-        <w:t>Section 2.10: Procedures for Rectification and Erasur</w:t>
+        <w:t>Section 2.10: Procedures for Rectification and Erasure</w:t>
+      </w:r>
+    </w:p>
+    <w:p>
+      <w:pPr>
+        <w:divId w:val="2122335989"/>
+        <w:rPr>
+          <w:rFonts w:eastAsia="Times New Roman"/>
+        </w:rPr>
+      </w:pPr>
+      <w:r>
+        <w:rPr>
+          <w:rFonts w:eastAsia="Times New Roman"/>
+        </w:rPr>
+        <w:t> </w:t>
+      </w:r>
+    </w:p>
+    <w:p>
+      <w:pPr>
+        <w:divId w:val="1216893704"/>
+        <w:rPr>
+          <w:rFonts w:eastAsia="Times New Roman"/>
+        </w:rPr>
+      </w:pPr>
+      <w:r>
+        <w:rPr>
+          <w:rFonts w:eastAsia="Times New Roman"/>
+        </w:rPr>
+        <w:t xml:space="preserve">1. </w:t>
       </w:r>
       <w:r>
         <w:rPr>
           <w:rStyle w:val="Strong"/>
           <w:rFonts w:eastAsia="Times New Roman"/>
         </w:rPr>
-        <w:t>e</w:t>
-      </w:r>
-    </w:p>
-    <w:p>
-      <w:pPr>
-        <w:divId w:val="2122335989"/>
+        <w:t>The Right to Rectification</w:t>
+      </w:r>
+      <w:r>
+        <w:rPr>
+          <w:rFonts w:eastAsia="Times New Roman"/>
+        </w:rPr>
+        <w:t xml:space="preserve"> (Art. 16 GDPR)</w:t>
+      </w:r>
+    </w:p>
+    <w:p>
+      <w:pPr>
+        <w:divId w:val="2031443053"/>
+        <w:rPr>
+          <w:rFonts w:eastAsia="Times New Roman"/>
+        </w:rPr>
+      </w:pPr>
+      <w:r>
+        <w:rPr>
+          <w:rFonts w:eastAsia="Times New Roman"/>
+        </w:rPr>
+        <w:t>If the NLP (Natural Language Processing) misinterprets a "Master's Degree" as a "Bachelor's," it unfairly lowers the score.</w:t>
+      </w:r>
+    </w:p>
+    <w:p>
+      <w:pPr>
+        <w:divId w:val="1534147435"/>
         <w:rPr>
           <w:rFonts w:eastAsia="Times New Roman"/>
         </w:rPr>
@@ -9550,48 +9145,146 @@
     </w:p>
     <w:p>
       <w:pPr>
-        <w:divId w:val="1216893704"/>
-        <w:rPr>
-          <w:rFonts w:eastAsia="Times New Roman"/>
-        </w:rPr>
-      </w:pPr>
-      <w:r>
-        <w:rPr>
-          <w:rFonts w:eastAsia="Times New Roman"/>
-        </w:rPr>
-        <w:t xml:space="preserve">1. </w:t>
+        <w:divId w:val="254024445"/>
+        <w:rPr>
+          <w:rFonts w:eastAsia="Times New Roman"/>
+        </w:rPr>
+      </w:pPr>
+      <w:r>
+        <w:rPr>
+          <w:rFonts w:eastAsia="Times New Roman"/>
+        </w:rPr>
+        <w:t>The Technical Mean: The "Candidate Validation" Screen. Immediately after upload, the system displays the extracted "Professional Tokens" (Skills, Education, Tenure) to the candidate.</w:t>
+      </w:r>
+    </w:p>
+    <w:p>
+      <w:pPr>
+        <w:divId w:val="1888300608"/>
+        <w:rPr>
+          <w:rFonts w:eastAsia="Times New Roman"/>
+        </w:rPr>
+      </w:pPr>
+      <w:r>
+        <w:rPr>
+          <w:rFonts w:eastAsia="Times New Roman"/>
+        </w:rPr>
+        <w:t> </w:t>
+      </w:r>
+    </w:p>
+    <w:p>
+      <w:pPr>
+        <w:divId w:val="1751655890"/>
+        <w:rPr>
+          <w:rFonts w:eastAsia="Times New Roman"/>
+        </w:rPr>
+      </w:pPr>
+      <w:r>
+        <w:rPr>
+          <w:rFonts w:eastAsia="Times New Roman"/>
+        </w:rPr>
+        <w:t>The Action: Candidates can click "Edit" to manually correct any parsing errors before the final "Match-Score" is generated.</w:t>
+      </w:r>
+    </w:p>
+    <w:p>
+      <w:pPr>
+        <w:divId w:val="1890069326"/>
+        <w:rPr>
+          <w:rFonts w:eastAsia="Times New Roman"/>
+        </w:rPr>
+      </w:pPr>
+      <w:r>
+        <w:rPr>
+          <w:rFonts w:eastAsia="Times New Roman"/>
+        </w:rPr>
+        <w:t>AI-Pro Step: Once a correction is saved, the system triggers an "Automatic Re-Scoring" to ensure the AI's output is based on the verified "ground truth" provided by the human.</w:t>
+      </w:r>
+    </w:p>
+    <w:p>
+      <w:pPr>
+        <w:divId w:val="1687445711"/>
+        <w:rPr>
+          <w:rFonts w:eastAsia="Times New Roman"/>
+        </w:rPr>
+      </w:pPr>
+      <w:r>
+        <w:rPr>
+          <w:rFonts w:eastAsia="Times New Roman"/>
+        </w:rPr>
+        <w:t> </w:t>
+      </w:r>
+    </w:p>
+    <w:p>
+      <w:pPr>
+        <w:divId w:val="74281741"/>
+        <w:rPr>
+          <w:rFonts w:eastAsia="Times New Roman"/>
+        </w:rPr>
+      </w:pPr>
+      <w:r>
+        <w:rPr>
+          <w:rFonts w:eastAsia="Times New Roman"/>
+        </w:rPr>
+        <w:t xml:space="preserve">2. </w:t>
       </w:r>
       <w:r>
         <w:rPr>
           <w:rStyle w:val="Strong"/>
           <w:rFonts w:eastAsia="Times New Roman"/>
         </w:rPr>
-        <w:t>The Right to Rectification</w:t>
-      </w:r>
-      <w:r>
-        <w:rPr>
-          <w:rFonts w:eastAsia="Times New Roman"/>
-        </w:rPr>
-        <w:t xml:space="preserve"> (Art. 16 GDPR)</w:t>
-      </w:r>
-    </w:p>
-    <w:p>
-      <w:pPr>
-        <w:divId w:val="2031443053"/>
-        <w:rPr>
-          <w:rFonts w:eastAsia="Times New Roman"/>
-        </w:rPr>
-      </w:pPr>
-      <w:r>
-        <w:rPr>
-          <w:rFonts w:eastAsia="Times New Roman"/>
-        </w:rPr>
-        <w:t>If the NLP (Natural Language Processing) misinterprets a "Master's Degree" as a "Bachelor's," it unfairly lowers the score.</w:t>
-      </w:r>
-    </w:p>
-    <w:p>
-      <w:pPr>
-        <w:divId w:val="1534147435"/>
+        <w:t>The Right to Erasure / "To be Forgotten"</w:t>
+      </w:r>
+      <w:r>
+        <w:rPr>
+          <w:rFonts w:eastAsia="Times New Roman"/>
+        </w:rPr>
+        <w:t xml:space="preserve"> (Art. 17 GDPR)</w:t>
+      </w:r>
+    </w:p>
+    <w:p>
+      <w:pPr>
+        <w:divId w:val="1825002998"/>
+        <w:rPr>
+          <w:rFonts w:eastAsia="Times New Roman"/>
+        </w:rPr>
+      </w:pPr>
+      <w:r>
+        <w:rPr>
+          <w:rFonts w:eastAsia="Times New Roman"/>
+        </w:rPr>
+        <w:t>The Technical Mean: A "Right to Erasure" request button in the Applicant Portal or a direct email to the DPO.</w:t>
+      </w:r>
+    </w:p>
+    <w:p>
+      <w:pPr>
+        <w:divId w:val="1412972039"/>
+        <w:rPr>
+          <w:rFonts w:eastAsia="Times New Roman"/>
+        </w:rPr>
+      </w:pPr>
+      <w:r>
+        <w:rPr>
+          <w:rFonts w:eastAsia="Times New Roman"/>
+        </w:rPr>
+        <w:t>The Action: Clicking this triggers an automated "Cascade Deletion."</w:t>
+      </w:r>
+    </w:p>
+    <w:p>
+      <w:pPr>
+        <w:divId w:val="619920710"/>
+        <w:rPr>
+          <w:rFonts w:eastAsia="Times New Roman"/>
+        </w:rPr>
+      </w:pPr>
+      <w:r>
+        <w:rPr>
+          <w:rFonts w:eastAsia="Times New Roman"/>
+        </w:rPr>
+        <w:t>AI-Pro Step (Cryptographic Erasure): As shown in your [Data Flow Diagram], the system uses Cryptographic Shredding. When a deletion is requested, the system destroys the unique encryption key associated with that candidate’s CANDIDATE_ID. Even if the encrypted data exists in a backup, it is rendered mathematically unrecoverable.</w:t>
+      </w:r>
+    </w:p>
+    <w:p>
+      <w:pPr>
+        <w:divId w:val="1017003663"/>
         <w:rPr>
           <w:rFonts w:eastAsia="Times New Roman"/>
         </w:rPr>
@@ -9605,27 +9298,36 @@
     </w:p>
     <w:p>
       <w:pPr>
-        <w:divId w:val="254024445"/>
-        <w:rPr>
-          <w:rFonts w:eastAsia="Times New Roman"/>
-        </w:rPr>
-      </w:pPr>
-      <w:r>
-        <w:rPr>
-          <w:rFonts w:eastAsia="Times New Roman"/>
-        </w:rPr>
-        <w:t xml:space="preserve">The Technical Mean: The "Candidate Validation" Screen. Immediately after upload, </w:t>
-      </w:r>
-      <w:r>
-        <w:rPr>
-          <w:rFonts w:eastAsia="Times New Roman"/>
-        </w:rPr>
-        <w:t>the system displays the extracted "Professional Tokens" (Skills, Education, Tenure) to the candidate.</w:t>
-      </w:r>
-    </w:p>
-    <w:p>
-      <w:pPr>
-        <w:divId w:val="1888300608"/>
+        <w:divId w:val="2130395279"/>
+        <w:rPr>
+          <w:rFonts w:eastAsia="Times New Roman"/>
+        </w:rPr>
+      </w:pPr>
+      <w:r>
+        <w:rPr>
+          <w:rStyle w:val="Strong"/>
+          <w:rFonts w:eastAsia="Times New Roman"/>
+        </w:rPr>
+        <w:t>Controls &amp; Response Times</w:t>
+      </w:r>
+    </w:p>
+    <w:p>
+      <w:pPr>
+        <w:divId w:val="1022436719"/>
+        <w:rPr>
+          <w:rFonts w:eastAsia="Times New Roman"/>
+        </w:rPr>
+      </w:pPr>
+      <w:r>
+        <w:rPr>
+          <w:rFonts w:eastAsia="Times New Roman"/>
+        </w:rPr>
+        <w:t>The 30-Day Rule: All requests are acknowledged immediately and fully processed within one month per GDPR Article 12(3).</w:t>
+      </w:r>
+    </w:p>
+    <w:p>
+      <w:pPr>
+        <w:divId w:val="638538627"/>
         <w:rPr>
           <w:rFonts w:eastAsia="Times New Roman"/>
         </w:rPr>
@@ -9639,198 +9341,6 @@
     </w:p>
     <w:p>
       <w:pPr>
-        <w:divId w:val="1751655890"/>
-        <w:rPr>
-          <w:rFonts w:eastAsia="Times New Roman"/>
-        </w:rPr>
-      </w:pPr>
-      <w:r>
-        <w:rPr>
-          <w:rFonts w:eastAsia="Times New Roman"/>
-        </w:rPr>
-        <w:t>The Action: Candidates can click "Edit" to manually correct any parsing errors before the final "Match-Score" is generated.</w:t>
-      </w:r>
-    </w:p>
-    <w:p>
-      <w:pPr>
-        <w:divId w:val="1890069326"/>
-        <w:rPr>
-          <w:rFonts w:eastAsia="Times New Roman"/>
-        </w:rPr>
-      </w:pPr>
-      <w:r>
-        <w:rPr>
-          <w:rFonts w:eastAsia="Times New Roman"/>
-        </w:rPr>
-        <w:t>AI-Pro Step: Once a correcti</w:t>
-      </w:r>
-      <w:r>
-        <w:rPr>
-          <w:rFonts w:eastAsia="Times New Roman"/>
-        </w:rPr>
-        <w:t>on is saved, the system triggers an "Automatic Re-Scoring" to ensure the AI's output is based on the verified "ground truth" provided by the human.</w:t>
-      </w:r>
-    </w:p>
-    <w:p>
-      <w:pPr>
-        <w:divId w:val="1687445711"/>
-        <w:rPr>
-          <w:rFonts w:eastAsia="Times New Roman"/>
-        </w:rPr>
-      </w:pPr>
-      <w:r>
-        <w:rPr>
-          <w:rFonts w:eastAsia="Times New Roman"/>
-        </w:rPr>
-        <w:t> </w:t>
-      </w:r>
-    </w:p>
-    <w:p>
-      <w:pPr>
-        <w:divId w:val="74281741"/>
-        <w:rPr>
-          <w:rFonts w:eastAsia="Times New Roman"/>
-        </w:rPr>
-      </w:pPr>
-      <w:r>
-        <w:rPr>
-          <w:rFonts w:eastAsia="Times New Roman"/>
-        </w:rPr>
-        <w:t xml:space="preserve">2. </w:t>
-      </w:r>
-      <w:r>
-        <w:rPr>
-          <w:rStyle w:val="Strong"/>
-          <w:rFonts w:eastAsia="Times New Roman"/>
-        </w:rPr>
-        <w:t>The Right to Erasure / "To be Forgotten"</w:t>
-      </w:r>
-      <w:r>
-        <w:rPr>
-          <w:rFonts w:eastAsia="Times New Roman"/>
-        </w:rPr>
-        <w:t xml:space="preserve"> (Art. 17 GDPR)</w:t>
-      </w:r>
-    </w:p>
-    <w:p>
-      <w:pPr>
-        <w:divId w:val="1825002998"/>
-        <w:rPr>
-          <w:rFonts w:eastAsia="Times New Roman"/>
-        </w:rPr>
-      </w:pPr>
-      <w:r>
-        <w:rPr>
-          <w:rFonts w:eastAsia="Times New Roman"/>
-        </w:rPr>
-        <w:t>The Technical Mean: A "Right to Erasure" reques</w:t>
-      </w:r>
-      <w:r>
-        <w:rPr>
-          <w:rFonts w:eastAsia="Times New Roman"/>
-        </w:rPr>
-        <w:t>t button in the Applicant Portal or a direct email to the DPO.</w:t>
-      </w:r>
-    </w:p>
-    <w:p>
-      <w:pPr>
-        <w:divId w:val="1412972039"/>
-        <w:rPr>
-          <w:rFonts w:eastAsia="Times New Roman"/>
-        </w:rPr>
-      </w:pPr>
-      <w:r>
-        <w:rPr>
-          <w:rFonts w:eastAsia="Times New Roman"/>
-        </w:rPr>
-        <w:t>The Action: Clicking this triggers an automated "Cascade Deletion."</w:t>
-      </w:r>
-    </w:p>
-    <w:p>
-      <w:pPr>
-        <w:divId w:val="619920710"/>
-        <w:rPr>
-          <w:rFonts w:eastAsia="Times New Roman"/>
-        </w:rPr>
-      </w:pPr>
-      <w:r>
-        <w:rPr>
-          <w:rFonts w:eastAsia="Times New Roman"/>
-        </w:rPr>
-        <w:t>AI-Pro Step (Cryptographic Erasure): As shown in your [Data Flow Diagram], the system uses Cryptographic Shredding. When a de</w:t>
-      </w:r>
-      <w:r>
-        <w:rPr>
-          <w:rFonts w:eastAsia="Times New Roman"/>
-        </w:rPr>
-        <w:t>letion is requested, the system destroys the unique encryption key associated with that candidate’s CANDIDATE_ID. Even if the encrypted data exists in a backup, it is rendered mathematically unrecoverable.</w:t>
-      </w:r>
-    </w:p>
-    <w:p>
-      <w:pPr>
-        <w:divId w:val="1017003663"/>
-        <w:rPr>
-          <w:rFonts w:eastAsia="Times New Roman"/>
-        </w:rPr>
-      </w:pPr>
-      <w:r>
-        <w:rPr>
-          <w:rFonts w:eastAsia="Times New Roman"/>
-        </w:rPr>
-        <w:t> </w:t>
-      </w:r>
-    </w:p>
-    <w:p>
-      <w:pPr>
-        <w:divId w:val="2130395279"/>
-        <w:rPr>
-          <w:rFonts w:eastAsia="Times New Roman"/>
-        </w:rPr>
-      </w:pPr>
-      <w:r>
-        <w:rPr>
-          <w:rStyle w:val="Strong"/>
-          <w:rFonts w:eastAsia="Times New Roman"/>
-        </w:rPr>
-        <w:t>Controls &amp; Response Times</w:t>
-      </w:r>
-    </w:p>
-    <w:p>
-      <w:pPr>
-        <w:divId w:val="1022436719"/>
-        <w:rPr>
-          <w:rFonts w:eastAsia="Times New Roman"/>
-        </w:rPr>
-      </w:pPr>
-      <w:r>
-        <w:rPr>
-          <w:rFonts w:eastAsia="Times New Roman"/>
-        </w:rPr>
-        <w:t>The 30-Day Rule: All r</w:t>
-      </w:r>
-      <w:r>
-        <w:rPr>
-          <w:rFonts w:eastAsia="Times New Roman"/>
-        </w:rPr>
-        <w:t>equests are acknowledged immediately and fully processed within one month per GDPR Article 12(3).</w:t>
-      </w:r>
-    </w:p>
-    <w:p>
-      <w:pPr>
-        <w:divId w:val="638538627"/>
-        <w:rPr>
-          <w:rFonts w:eastAsia="Times New Roman"/>
-        </w:rPr>
-      </w:pPr>
-      <w:r>
-        <w:rPr>
-          <w:rFonts w:eastAsia="Times New Roman"/>
-        </w:rPr>
-        <w:t> </w:t>
-      </w:r>
-    </w:p>
-    <w:p>
-      <w:pPr>
         <w:divId w:val="2039547605"/>
         <w:rPr>
           <w:rFonts w:eastAsia="Times New Roman"/>
@@ -9841,13 +9351,7 @@
           <w:rFonts w:eastAsia="Times New Roman"/>
         </w:rPr>
         <w:lastRenderedPageBreak/>
-        <w:t>Propagation to Sub-Processors: RecruitSmart sends an automated API "Delete" command to any third-party processors (e.g., the cloud host or a coding test pro</w:t>
-      </w:r>
-      <w:r>
-        <w:rPr>
-          <w:rFonts w:eastAsia="Times New Roman"/>
-        </w:rPr>
-        <w:t>vider) to ensure the data is scrubbed across the entire technical stack.</w:t>
+        <w:t>Propagation to Sub-Processors: RecruitSmart sends an automated API "Delete" command to any third-party processors (e.g., the cloud host or a coding test provider) to ensure the data is scrubbed across the entire technical stack.</w:t>
       </w:r>
     </w:p>
     <w:p>
@@ -9890,13 +9394,7 @@
         <w:rPr>
           <w:rFonts w:eastAsia="Times New Roman"/>
         </w:rPr>
-        <w:t>How can data sub</w:t>
-      </w:r>
-      <w:r>
-        <w:rPr>
-          <w:rFonts w:eastAsia="Times New Roman"/>
-        </w:rPr>
-        <w:t>jects exercise their rights to restriction and to object?</w:t>
+        <w:t>How can data subjects exercise their rights to restriction and to object?</w:t>
       </w:r>
     </w:p>
     <w:p>
@@ -9906,10 +9404,7 @@
         <w:divId w:val="1448695446"/>
       </w:pPr>
       <w:r>
-        <w:t>Objection and restriction rights are managed through an 'Opt-out of Automation' workflow. Upon objection, the system enforces a technical bypass of the algorithmic scoring layer, ensuring the data s</w:t>
-      </w:r>
-      <w:r>
-        <w:t>ubject is evaluated exclusively through human intervention. Restriction requests trigger a 'Logical Lock' on the database entry, preventing further processing while maintaining data integrity for dispute resolution</w:t>
+        <w:t>Objection and restriction rights are managed through an 'Opt-out of Automation' workflow. Upon objection, the system enforces a technical bypass of the algorithmic scoring layer, ensuring the data subject is evaluated exclusively through human intervention. Restriction requests trigger a 'Logical Lock' on the database entry, preventing further processing while maintaining data integrity for dispute resolution</w:t>
       </w:r>
     </w:p>
     <w:p>
@@ -9918,10 +9413,7 @@
         <w:divId w:val="1448695446"/>
       </w:pPr>
       <w:r>
-        <w:t>Section 2.11: Rights to Restriction and</w:t>
-      </w:r>
-      <w:r>
-        <w:t xml:space="preserve"> Objection</w:t>
+        <w:t>Section 2.11: Rights to Restriction and Objection</w:t>
       </w:r>
     </w:p>
     <w:p>
@@ -9957,10 +9449,7 @@
         <w:divId w:val="1448695446"/>
       </w:pPr>
       <w:r>
-        <w:t>The AI-Pro Workflow: If a candidate objects, the syste</w:t>
-      </w:r>
-      <w:r>
-        <w:t>m bypasses the NLP/Scoring Model entirely. The CV is flagged with a "Human-Only" tag and routed directly to an HR manager’s manual queue.</w:t>
+        <w:t>The AI-Pro Workflow: If a candidate objects, the system bypasses the NLP/Scoring Model entirely. The CV is flagged with a "Human-Only" tag and routed directly to an HR manager’s manual queue.</w:t>
       </w:r>
     </w:p>
     <w:p>
@@ -9969,10 +9458,7 @@
         <w:divId w:val="1448695446"/>
       </w:pPr>
       <w:r>
-        <w:t>The Guarantee: The project ensures that choosing "Manual Review" does not lower the candidate's priority or visibility</w:t>
-      </w:r>
-      <w:r>
-        <w:t>; it simply changes the method of evaluation.</w:t>
+        <w:t>The Guarantee: The project ensures that choosing "Manual Review" does not lower the candidate's priority or visibility; it simply changes the method of evaluation.</w:t>
       </w:r>
     </w:p>
     <w:p>
@@ -9999,10 +9485,7 @@
         <w:divId w:val="1448695446"/>
       </w:pPr>
       <w:r>
-        <w:t>The Control: A "Freeze Processing" status in the Supporti</w:t>
-      </w:r>
-      <w:r>
-        <w:t>ng Assets (Database).</w:t>
+        <w:t>The Control: A "Freeze Processing" status in the Supporting Assets (Database).</w:t>
       </w:r>
     </w:p>
     <w:p>
@@ -10020,10 +9503,7 @@
         <w:divId w:val="1448695446"/>
       </w:pPr>
       <w:r>
-        <w:t>Duration: The data stays "</w:t>
-      </w:r>
-      <w:r>
-        <w:t>frozen" until the dispute (e.g., a bias claim or data accuracy issue) is resolved by the DPO.</w:t>
+        <w:t>Duration: The data stays "frozen" until the dispute (e.g., a bias claim or data accuracy issue) is resolved by the DPO.</w:t>
       </w:r>
     </w:p>
     <w:p>
@@ -10042,10 +9522,7 @@
       </w:pPr>
       <w:r>
         <w:lastRenderedPageBreak/>
-        <w:t>Direct Contact Point: A dedicated "Privacy Request" button in the Applicant Portal that pre-fills an emai</w:t>
-      </w:r>
-      <w:r>
-        <w:t>l to the DPO with the subject line: "Exercise of Right to Object - [Candidate ID]".</w:t>
+        <w:t>Direct Contact Point: A dedicated "Privacy Request" button in the Applicant Portal that pre-fills an email to the DPO with the subject line: "Exercise of Right to Object - [Candidate ID]".</w:t>
       </w:r>
     </w:p>
     <w:p>
@@ -10054,10 +9531,7 @@
         <w:divId w:val="1448695446"/>
       </w:pPr>
       <w:r>
-        <w:t>Automated Workflow Triggers: When an objection is logged, the system triggers a "Processing Block" at the API level, ensuring the AI model cannot pull that specific Candida</w:t>
-      </w:r>
-      <w:r>
-        <w:t>te_ID into its next batch-scoring run.</w:t>
+        <w:t>Automated Workflow Triggers: When an objection is logged, the system triggers a "Processing Block" at the API level, ensuring the AI model cannot pull that specific Candidate_ID into its next batch-scoring run.</w:t>
       </w:r>
     </w:p>
     <w:p>
@@ -10066,10 +9540,7 @@
         <w:divId w:val="1448695446"/>
       </w:pPr>
       <w:r>
-        <w:t>Transparency of Choice: The Information Notice (Section 2.7) explicitly states: "You have the right to object to the automated analysis of your CV. In such cases, your application will be reviewed manually by a member</w:t>
-      </w:r>
-      <w:r>
-        <w:t xml:space="preserve"> of our recruitment team."</w:t>
+        <w:t>Transparency of Choice: The Information Notice (Section 2.7) explicitly states: "You have the right to object to the automated analysis of your CV. In such cases, your application will be reviewed manually by a member of our recruitment team."</w:t>
       </w:r>
     </w:p>
     <w:p>
@@ -10108,13 +9579,7 @@
         <w:rPr>
           <w:rFonts w:eastAsia="Times New Roman"/>
         </w:rPr>
-        <w:t>All processing activities are governed by Article 28-compliant contracts. We have specifically mandated that our AI provider (NeuralHire) main</w:t>
-      </w:r>
-      <w:r>
-        <w:rPr>
-          <w:rFonts w:eastAsia="Times New Roman"/>
-        </w:rPr>
-        <w:t>tains Sovereign Data Hosting within the EEA. Furthermore, our contracts explicitly prohibit the 're-use' of candidate data for third-party machine learning training, ensuring the integrity of our trade secrets and candidate privacy</w:t>
+        <w:t>All processing activities are governed by Article 28-compliant contracts. We have specifically mandated that our AI provider (NeuralHire) maintains Sovereign Data Hosting within the EEA. Furthermore, our contracts explicitly prohibit the 're-use' of candidate data for third-party machine learning training, ensuring the integrity of our trade secrets and candidate privacy</w:t>
       </w:r>
     </w:p>
     <w:tbl>
@@ -10172,13 +9637,7 @@
               <w:rPr>
                 <w:rFonts w:eastAsia="Times New Roman"/>
               </w:rPr>
-              <w:t>Mission</w:t>
-            </w:r>
-            <w:r>
-              <w:rPr>
-                <w:rFonts w:eastAsia="Times New Roman"/>
-              </w:rPr>
-              <w:t>/Scope</w:t>
+              <w:t>Mission/Scope</w:t>
             </w:r>
           </w:p>
         </w:tc>
@@ -10451,13 +9910,7 @@
               <w:rPr>
                 <w:rFonts w:eastAsia="Times New Roman"/>
               </w:rPr>
-              <w:t>ISO 27001; CISPE Co</w:t>
-            </w:r>
-            <w:r>
-              <w:rPr>
-                <w:rFonts w:eastAsia="Times New Roman"/>
-              </w:rPr>
-              <w:t>de of Conduct (GDPR compliant cloud).</w:t>
+              <w:t>ISO 27001; CISPE Code of Conduct (GDPR compliant cloud).</w:t>
             </w:r>
           </w:p>
         </w:tc>
@@ -10696,14 +10149,7 @@
           <w:rStyle w:val="Strong"/>
           <w:rFonts w:eastAsia="Times New Roman"/>
         </w:rPr>
-        <w:t> Contra</w:t>
-      </w:r>
-      <w:r>
-        <w:rPr>
-          <w:rStyle w:val="Strong"/>
-          <w:rFonts w:eastAsia="Times New Roman"/>
-        </w:rPr>
-        <w:t>ctual Clauses:</w:t>
+        <w:t> Contractual Clauses:</w:t>
       </w:r>
     </w:p>
     <w:p>
@@ -10755,13 +10201,7 @@
         <w:rPr>
           <w:rFonts w:eastAsia="Times New Roman"/>
         </w:rPr>
-        <w:t>: The contract grants the Data Contro</w:t>
-      </w:r>
-      <w:r>
-        <w:rPr>
-          <w:rFonts w:eastAsia="Times New Roman"/>
-        </w:rPr>
-        <w:t>ller (your company) the right to conduct an annual security and "bias audit" of the processor’s environment.</w:t>
+        <w:t>: The contract grants the Data Controller (your company) the right to conduct an annual security and "bias audit" of the processor’s environment.</w:t>
       </w:r>
     </w:p>
     <w:p>
@@ -10805,13 +10245,7 @@
         <w:rPr>
           <w:rFonts w:eastAsia="Times New Roman"/>
         </w:rPr>
-        <w:t xml:space="preserve">: The processor must have a technical API that allows you to trigger Erasure or Rectification </w:t>
-      </w:r>
-      <w:r>
-        <w:rPr>
-          <w:rFonts w:eastAsia="Times New Roman"/>
-        </w:rPr>
-        <w:t>commands that propagate to their systems instantly.</w:t>
+        <w:t>: The processor must have a technical API that allows you to trigger Erasure or Rectification commands that propagate to their systems instantly.</w:t>
       </w:r>
     </w:p>
     <w:p>
@@ -10863,13 +10297,7 @@
         <w:rPr>
           <w:rFonts w:eastAsia="Times New Roman"/>
         </w:rPr>
-        <w:t xml:space="preserve"> "The Processor shall only process personal data on documented instructions fro</w:t>
-      </w:r>
-      <w:r>
-        <w:rPr>
-          <w:rFonts w:eastAsia="Times New Roman"/>
-        </w:rPr>
-        <w:t>m the Controller, including with regard to transfers of personal data to a third country."</w:t>
+        <w:t xml:space="preserve"> "The Processor shall only process personal data on documented instructions from the Controller, including with regard to transfers of personal data to a third country."</w:t>
       </w:r>
     </w:p>
     <w:p>
@@ -10890,13 +10318,7 @@
         <w:rPr>
           <w:rFonts w:eastAsia="Times New Roman"/>
         </w:rPr>
-        <w:t>: "The Processor ensures that persons authorized to process the personal data have committed themselves to confidentiality or are under an appropria</w:t>
-      </w:r>
-      <w:r>
-        <w:rPr>
-          <w:rFonts w:eastAsia="Times New Roman"/>
-        </w:rPr>
-        <w:t>te statutory obligation of confidentiality."</w:t>
+        <w:t>: "The Processor ensures that persons authorized to process the personal data have committed themselves to confidentiality or are under an appropriate statutory obligation of confidentiality."</w:t>
       </w:r>
     </w:p>
     <w:p>
@@ -10940,19 +10362,7 @@
         <w:rPr>
           <w:rFonts w:eastAsia="Times New Roman"/>
         </w:rPr>
-        <w:t>The RecruitSmart architecture prioritizes Local Data Residency within the EEA. For necessary auxiliary services locat</w:t>
-      </w:r>
-      <w:r>
-        <w:rPr>
-          <w:rFonts w:eastAsia="Times New Roman"/>
-        </w:rPr>
-        <w:t xml:space="preserve">ed in the U.S., we rely on the EU-U.S. Data Privacy Framework supplemented by the 2021 Standard Contractual Clauses. Furthermore, we have implemented 'Data Minimization at Edge,' ensuring that only non-sensitive identifiers are transferred, while the core </w:t>
-      </w:r>
-      <w:r>
-        <w:rPr>
-          <w:rFonts w:eastAsia="Times New Roman"/>
-        </w:rPr>
-        <w:t>AI-processed professional data remains on sovereign French infrastructure.</w:t>
+        <w:t>The RecruitSmart architecture prioritizes Local Data Residency within the EEA. For necessary auxiliary services located in the U.S., we rely on the EU-U.S. Data Privacy Framework supplemented by the 2021 Standard Contractual Clauses. Furthermore, we have implemented 'Data Minimization at Edge,' ensuring that only non-sensitive identifiers are transferred, while the core AI-processed professional data remains on sovereign French infrastructure.</w:t>
       </w:r>
     </w:p>
     <w:tbl>
@@ -11356,13 +10766,7 @@
               <w:rPr>
                 <w:rFonts w:eastAsia="Times New Roman"/>
               </w:rPr>
-              <w:t>EU-U.S. Data Privacy Framework: SendGrid is certified under the DP</w:t>
-            </w:r>
-            <w:r>
-              <w:rPr>
-                <w:rFonts w:eastAsia="Times New Roman"/>
-              </w:rPr>
-              <w:t>F. We also enforce Standard Contractual Clauses (SCCs) as a backup.</w:t>
+              <w:t>EU-U.S. Data Privacy Framework: SendGrid is certified under the DPF. We also enforce Standard Contractual Clauses (SCCs) as a backup.</w:t>
             </w:r>
           </w:p>
         </w:tc>
@@ -11449,13 +10853,7 @@
               <w:rPr>
                 <w:rFonts w:eastAsia="Times New Roman"/>
               </w:rPr>
-              <w:t>UK: Beneficiary of an adequacy decision. USA: Access is limited to "Technical Support" only via Virtual Desktop Infrastructure (VDI) w</w:t>
-            </w:r>
-            <w:r>
-              <w:rPr>
-                <w:rFonts w:eastAsia="Times New Roman"/>
-              </w:rPr>
-              <w:t>here data never leaves the EU server.</w:t>
+              <w:t>UK: Beneficiary of an adequacy decision. USA: Access is limited to "Technical Support" only via Virtual Desktop Infrastructure (VDI) where data never leaves the EU server.</w:t>
             </w:r>
           </w:p>
         </w:tc>
@@ -11553,13 +10951,7 @@
         <w:rPr>
           <w:rFonts w:eastAsia="Times New Roman"/>
         </w:rPr>
-        <w:t>For any U.S.-based tool (like S</w:t>
-      </w:r>
-      <w:r>
-        <w:rPr>
-          <w:rFonts w:eastAsia="Times New Roman"/>
-        </w:rPr>
-        <w:t>endGrid), the CNIL requires more than just a contract.</w:t>
+        <w:t>For any U.S.-based tool (like SendGrid), the CNIL requires more than just a contract.</w:t>
       </w:r>
     </w:p>
     <w:p>
@@ -11600,13 +10992,7 @@
         <w:rPr>
           <w:rFonts w:eastAsia="Times New Roman"/>
         </w:rPr>
-        <w:t>. The candidate's CV, match-score, and professional</w:t>
-      </w:r>
-      <w:r>
-        <w:rPr>
-          <w:rFonts w:eastAsia="Times New Roman"/>
-        </w:rPr>
-        <w:t xml:space="preserve"> history remain strictly in France.</w:t>
+        <w:t>. The candidate's CV, match-score, and professional history remain strictly in France.</w:t>
       </w:r>
     </w:p>
     <w:p>
@@ -11663,13 +11049,7 @@
         <w:rPr>
           <w:rFonts w:eastAsia="Times New Roman"/>
         </w:rPr>
-        <w:t>The Control: If a U</w:t>
-      </w:r>
-      <w:r>
-        <w:rPr>
-          <w:rFonts w:eastAsia="Times New Roman"/>
-        </w:rPr>
-        <w:t>.S. engineer needs to fix a bug in the AI scoring model, they are granted "Zero-Trust" remote access. They can see the code, but they cannot download or export the candidate database.</w:t>
+        <w:t>The Control: If a U.S. engineer needs to fix a bug in the AI scoring model, they are granted "Zero-Trust" remote access. They can see the code, but they cannot download or export the candidate database.</w:t>
       </w:r>
     </w:p>
     <w:p>
@@ -11744,14 +11124,7 @@
           <w:rStyle w:val="Strong"/>
           <w:rFonts w:eastAsia="Times New Roman"/>
         </w:rPr>
-        <w:t>AI-S</w:t>
-      </w:r>
-      <w:r>
-        <w:rPr>
-          <w:rStyle w:val="Strong"/>
-          <w:rFonts w:eastAsia="Times New Roman"/>
-        </w:rPr>
-        <w:t>pecific Controls </w:t>
+        <w:t>AI-Specific Controls </w:t>
       </w:r>
     </w:p>
     <w:p>
@@ -11797,13 +11170,7 @@
         <w:rPr>
           <w:rFonts w:eastAsia="Times New Roman"/>
         </w:rPr>
-        <w:t>Adversaria</w:t>
-      </w:r>
-      <w:r>
-        <w:rPr>
-          <w:rFonts w:eastAsia="Times New Roman"/>
-        </w:rPr>
-        <w:t>l Testing: We perform "Penetration Testing" specifically for AI—attempting to "trick" the model into revealing private training data through Model Inversion attacks.</w:t>
+        <w:t>Adversarial Testing: We perform "Penetration Testing" specifically for AI—attempting to "trick" the model into revealing private training data through Model Inversion attacks.</w:t>
       </w:r>
     </w:p>
     <w:p>
@@ -11875,14 +11242,7 @@
           <w:rStyle w:val="Strong"/>
           <w:rFonts w:eastAsia="Times New Roman"/>
         </w:rPr>
-        <w:t>Organizational Measures (Governan</w:t>
-      </w:r>
-      <w:r>
-        <w:rPr>
-          <w:rStyle w:val="Strong"/>
-          <w:rFonts w:eastAsia="Times New Roman"/>
-        </w:rPr>
-        <w:t>ce)</w:t>
+        <w:t>Organizational Measures (Governance)</w:t>
       </w:r>
     </w:p>
     <w:p>
@@ -11928,13 +11288,7 @@
         <w:rPr>
           <w:rFonts w:eastAsia="Times New Roman"/>
         </w:rPr>
-        <w:t>Staff Training: Mandatory training for all recruiters on "Algorithmic Liter</w:t>
-      </w:r>
-      <w:r>
-        <w:rPr>
-          <w:rFonts w:eastAsia="Times New Roman"/>
-        </w:rPr>
-        <w:t>acy"—ensuring they understand that the AI is a recommendation tool, not a final decision-maker.</w:t>
+        <w:t>Staff Training: Mandatory training for all recruiters on "Algorithmic Literacy"—ensuring they understand that the AI is a recommendation tool, not a final decision-maker.</w:t>
       </w:r>
     </w:p>
     <w:p>
@@ -11961,13 +11315,7 @@
         <w:rPr>
           <w:rFonts w:eastAsia="Times New Roman"/>
         </w:rPr>
-        <w:t>Incident Response Plan: A specific protocol for "Model Anomalies" (e.g., if the AI suddenly gives everyone a 0 score), which includes immediate processing sus</w:t>
-      </w:r>
-      <w:r>
-        <w:rPr>
-          <w:rFonts w:eastAsia="Times New Roman"/>
-        </w:rPr>
-        <w:t>pension.</w:t>
+        <w:t>Incident Response Plan: A specific protocol for "Model Anomalies" (e.g., if the AI suddenly gives everyone a 0 score), which includes immediate processing suspension.</w:t>
       </w:r>
     </w:p>
     <w:p>
@@ -12045,13 +11393,7 @@
         <w:rPr>
           <w:rFonts w:eastAsia="Times New Roman"/>
         </w:rPr>
-        <w:t>Mul</w:t>
-      </w:r>
-      <w:r>
-        <w:rPr>
-          <w:rFonts w:eastAsia="Times New Roman"/>
-        </w:rPr>
-        <w:t>ti-Factor Authentication (MFA): Mandatory for all access to the Supporting Assets (AWS/PostgreSQL).</w:t>
+        <w:t>Multi-Factor Authentication (MFA): Mandatory for all access to the Supporting Assets (AWS/PostgreSQL).</w:t>
       </w:r>
     </w:p>
     <w:p>
@@ -12070,13 +11412,7 @@
         <w:rPr>
           <w:rFonts w:eastAsia="Times New Roman"/>
         </w:rPr>
-        <w:t>Data Minimization at the Edge: The Redaction Engine (as seen in your diagram) automatically strips sensitive attributes before the AI processes the file, pr</w:t>
-      </w:r>
-      <w:r>
-        <w:rPr>
-          <w:rFonts w:eastAsia="Times New Roman"/>
-        </w:rPr>
-        <w:t>eventing the model from ever "knowing" the candidate's gender or age.</w:t>
+        <w:t>Data Minimization at the Edge: The Redaction Engine (as seen in your diagram) automatically strips sensitive attributes before the AI processes the file, preventing the model from ever "knowing" the candidate's gender or age.</w:t>
       </w:r>
     </w:p>
     <w:p>
@@ -12176,13 +11512,7 @@
         <w:rPr>
           <w:rFonts w:eastAsia="Times New Roman"/>
         </w:rPr>
-        <w:t>What could b</w:t>
-      </w:r>
-      <w:r>
-        <w:rPr>
-          <w:rFonts w:eastAsia="Times New Roman"/>
-        </w:rPr>
-        <w:t xml:space="preserve">e the main </w:t>
+        <w:t xml:space="preserve">What could be the main </w:t>
       </w:r>
       <w:r>
         <w:rPr>
@@ -12238,13 +11568,7 @@
         <w:rPr>
           <w:rFonts w:eastAsia="Times New Roman"/>
         </w:rPr>
-        <w:t xml:space="preserve"> </w:t>
-      </w:r>
-      <w:r>
-        <w:rPr>
-          <w:rFonts w:eastAsia="Times New Roman"/>
-        </w:rPr>
-        <w:t>that could lead to the risk?</w:t>
+        <w:t xml:space="preserve"> that could lead to the risk?</w:t>
       </w:r>
     </w:p>
     <w:p>
@@ -12300,13 +11624,7 @@
         <w:rPr>
           <w:rFonts w:eastAsia="Times New Roman"/>
         </w:rPr>
-        <w:t>Malicious External Actor (</w:t>
-      </w:r>
-      <w:r>
-        <w:rPr>
-          <w:rFonts w:eastAsia="Times New Roman"/>
-        </w:rPr>
-        <w:t>Hacker), Professional cybercriminals, Negligent Internal Staff, Malicious Insider: A disgruntled employee, Bribed recruiter, Competitor / Corporate Spy</w:t>
+        <w:t>Malicious External Actor (Hacker), Professional cybercriminals, Negligent Internal Staff, Malicious Insider: A disgruntled employee, Bribed recruiter, Competitor / Corporate Spy</w:t>
       </w:r>
     </w:p>
     <w:p>
@@ -12348,13 +11666,7 @@
         <w:rPr>
           <w:rFonts w:eastAsia="Times New Roman"/>
         </w:rPr>
-        <w:t>Traceability &amp; Robustness, G</w:t>
-      </w:r>
-      <w:r>
-        <w:rPr>
-          <w:rFonts w:eastAsia="Times New Roman"/>
-        </w:rPr>
-        <w:t>overnance And Technical Control</w:t>
+        <w:t>Traceability &amp; Robustness, Governance And Technical Control</w:t>
       </w:r>
     </w:p>
     <w:p>
@@ -12396,19 +11708,7 @@
         <w:rPr>
           <w:rFonts w:eastAsia="Times New Roman"/>
         </w:rPr>
-        <w:t xml:space="preserve">Important, The Severity is estimated as High (3) because the processing involves extensive professional and contact data </w:t>
-      </w:r>
-      <w:r>
-        <w:rPr>
-          <w:rFonts w:eastAsia="Times New Roman"/>
-        </w:rPr>
-        <w:t xml:space="preserve">of thousands of individuals. While our Redaction Engine and Pseudonymization measures mitigate the risk of mass discrimination during a breach, the potential for identity theft and professional reputational damage remains significant for the data subjects </w:t>
-      </w:r>
-      <w:r>
-        <w:rPr>
-          <w:rFonts w:eastAsia="Times New Roman"/>
-        </w:rPr>
-        <w:t>if their contact information and match-scores are compromised.</w:t>
+        <w:t>Important, The Severity is estimated as High (3) because the processing involves extensive professional and contact data of thousands of individuals. While our Redaction Engine and Pseudonymization measures mitigate the risk of mass discrimination during a breach, the potential for identity theft and professional reputational damage remains significant for the data subjects if their contact information and match-scores are compromised.</w:t>
       </w:r>
     </w:p>
     <w:p>
@@ -12450,19 +11750,7 @@
         <w:rPr>
           <w:rFonts w:eastAsia="Times New Roman"/>
         </w:rPr>
-        <w:t>Limited, The likelihood of illegitimate access is estimated as Limited be</w:t>
-      </w:r>
-      <w:r>
-        <w:rPr>
-          <w:rFonts w:eastAsia="Times New Roman"/>
-        </w:rPr>
-        <w:t>cause, although the risk sources (hackers) have the capability to launch automated attacks, our existing and planned controls create a high barrier to entry. Specifically, the use of Multi-Factor Authentication (MFA) and IP Whitelisting makes credential ha</w:t>
-      </w:r>
-      <w:r>
-        <w:rPr>
-          <w:rFonts w:eastAsia="Times New Roman"/>
-        </w:rPr>
-        <w:t>rvesting and external database access 'difficult' for unauthorized sources. Furthermore, the Redaction Engine reduces the value of any potentially accessed data, lowering the incentive for targeted attacks.</w:t>
+        <w:t>Limited, The likelihood of illegitimate access is estimated as Limited because, although the risk sources (hackers) have the capability to launch automated attacks, our existing and planned controls create a high barrier to entry. Specifically, the use of Multi-Factor Authentication (MFA) and IP Whitelisting makes credential harvesting and external database access 'difficult' for unauthorized sources. Furthermore, the Redaction Engine reduces the value of any potentially accessed data, lowering the incentive for targeted attacks.</w:t>
       </w:r>
     </w:p>
     <w:p>
@@ -12507,13 +11795,7 @@
         <w:rPr>
           <w:rFonts w:eastAsia="Times New Roman"/>
         </w:rPr>
-        <w:t>What could be</w:t>
-      </w:r>
-      <w:r>
-        <w:rPr>
-          <w:rFonts w:eastAsia="Times New Roman"/>
-        </w:rPr>
-        <w:t xml:space="preserve"> the main </w:t>
+        <w:t xml:space="preserve">What could be the main </w:t>
       </w:r>
       <w:r>
         <w:rPr>
@@ -12625,13 +11907,7 @@
         <w:rPr>
           <w:rFonts w:eastAsia="Times New Roman"/>
         </w:rPr>
-        <w:t>Malicious External Actor (Hacker), Bribed</w:t>
-      </w:r>
-      <w:r>
-        <w:rPr>
-          <w:rFonts w:eastAsia="Times New Roman"/>
-        </w:rPr>
-        <w:t xml:space="preserve"> recruiter</w:t>
+        <w:t>Malicious External Actor (Hacker), Bribed recruiter</w:t>
       </w:r>
     </w:p>
     <w:p>
@@ -12730,13 +12006,7 @@
         <w:rPr>
           <w:rFonts w:eastAsia="Times New Roman"/>
         </w:rPr>
-        <w:t>How do</w:t>
-      </w:r>
-      <w:r>
-        <w:rPr>
-          <w:rFonts w:eastAsia="Times New Roman"/>
-        </w:rPr>
-        <w:t xml:space="preserve"> you estimate the </w:t>
+        <w:t xml:space="preserve">How do you estimate the </w:t>
       </w:r>
       <w:r>
         <w:rPr>
@@ -12835,13 +12105,7 @@
         <w:rPr>
           <w:rFonts w:eastAsia="Times New Roman"/>
         </w:rPr>
-        <w:t xml:space="preserve">Professional &amp; </w:t>
-      </w:r>
-      <w:r>
-        <w:rPr>
-          <w:rFonts w:eastAsia="Times New Roman"/>
-        </w:rPr>
-        <w:t>Reputational Damage</w:t>
+        <w:t>Professional &amp; Reputational Damage</w:t>
       </w:r>
     </w:p>
     <w:p>
@@ -12967,13 +12231,7 @@
         <w:rPr>
           <w:rFonts w:eastAsia="Times New Roman"/>
         </w:rPr>
-        <w:t>Traceability &amp; Robustne</w:t>
-      </w:r>
-      <w:r>
-        <w:rPr>
-          <w:rFonts w:eastAsia="Times New Roman"/>
-        </w:rPr>
-        <w:t>ss</w:t>
+        <w:t>Traceability &amp; Robustness</w:t>
       </w:r>
     </w:p>
     <w:p>
@@ -13044,13 +12302,7 @@
         <w:rPr>
           <w:rFonts w:eastAsia="Times New Roman"/>
         </w:rPr>
-        <w:t>, especially in respect of threats, sources of risk and plan</w:t>
-      </w:r>
-      <w:r>
-        <w:rPr>
-          <w:rFonts w:eastAsia="Times New Roman"/>
-        </w:rPr>
-        <w:t>ned controls?</w:t>
+        <w:t>, especially in respect of threats, sources of risk and planned controls?</w:t>
       </w:r>
     </w:p>
     <w:p>
@@ -13096,6 +12348,890 @@
         </w:rPr>
         <w:t>Risks overview</w:t>
       </w:r>
+    </w:p>
+    <w:p>
+      <w:pPr>
+        <w:pStyle w:val="Heading2"/>
+        <w:divId w:val="1875076936"/>
+        <w:rPr>
+          <w:rFonts w:eastAsia="Times New Roman"/>
+        </w:rPr>
+      </w:pPr>
+    </w:p>
+    <w:p>
+      <w:pPr>
+        <w:pStyle w:val="Heading2"/>
+        <w:divId w:val="1875076936"/>
+        <w:rPr>
+          <w:rFonts w:eastAsia="Times New Roman"/>
+        </w:rPr>
+      </w:pPr>
+    </w:p>
+    <w:p>
+      <w:pPr>
+        <w:pStyle w:val="Heading2"/>
+        <w:divId w:val="1875076936"/>
+        <w:rPr>
+          <w:rFonts w:eastAsia="Times New Roman"/>
+        </w:rPr>
+      </w:pPr>
+    </w:p>
+    <w:p>
+      <w:pPr>
+        <w:pStyle w:val="Heading2"/>
+        <w:divId w:val="1875076936"/>
+        <w:rPr>
+          <w:rFonts w:eastAsia="Times New Roman"/>
+        </w:rPr>
+      </w:pPr>
+    </w:p>
+    <w:p>
+      <w:pPr>
+        <w:pStyle w:val="Heading2"/>
+        <w:divId w:val="1875076936"/>
+        <w:rPr>
+          <w:rFonts w:eastAsia="Times New Roman"/>
+        </w:rPr>
+      </w:pPr>
+    </w:p>
+    <w:p>
+      <w:pPr>
+        <w:pStyle w:val="Heading2"/>
+        <w:divId w:val="1875076936"/>
+        <w:rPr>
+          <w:rFonts w:eastAsia="Times New Roman"/>
+        </w:rPr>
+      </w:pPr>
+      <w:r>
+        <w:rPr>
+          <w:rFonts w:eastAsia="Times New Roman"/>
+        </w:rPr>
+        <w:t>FRIA/AIA</w:t>
+      </w:r>
+    </w:p>
+    <w:p>
+      <w:pPr>
+        <w:pStyle w:val="Heading2"/>
+        <w:divId w:val="1875076936"/>
+        <w:rPr>
+          <w:rFonts w:eastAsia="Times New Roman"/>
+        </w:rPr>
+      </w:pPr>
+      <w:r>
+        <w:rPr>
+          <w:rFonts w:eastAsia="Times New Roman"/>
+        </w:rPr>
+        <w:t>1. Fundamental Rights Impact (Beyond Privacy)</w:t>
+      </w:r>
+    </w:p>
+    <w:tbl>
+      <w:tblPr>
+        <w:tblStyle w:val="PlainTable5"/>
+        <w:tblW w:w="9770" w:type="dxa"/>
+        <w:tblInd w:w="-270" w:type="dxa"/>
+        <w:tblLook w:val="04A0" w:firstRow="1" w:lastRow="0" w:firstColumn="1" w:lastColumn="0" w:noHBand="0" w:noVBand="1"/>
+      </w:tblPr>
+      <w:tblGrid>
+        <w:gridCol w:w="3180"/>
+        <w:gridCol w:w="4020"/>
+        <w:gridCol w:w="2570"/>
+      </w:tblGrid>
+      <w:tr>
+        <w:trPr>
+          <w:cnfStyle w:val="100000000000" w:firstRow="1" w:lastRow="0" w:firstColumn="0" w:lastColumn="0" w:oddVBand="0" w:evenVBand="0" w:oddHBand="0" w:evenHBand="0" w:firstRowFirstColumn="0" w:firstRowLastColumn="0" w:lastRowFirstColumn="0" w:lastRowLastColumn="0"/>
+          <w:divId w:val="1875076936"/>
+          <w:trHeight w:val="312"/>
+        </w:trPr>
+        <w:tc>
+          <w:tcPr>
+            <w:cnfStyle w:val="001000000100" w:firstRow="0" w:lastRow="0" w:firstColumn="1" w:lastColumn="0" w:oddVBand="0" w:evenVBand="0" w:oddHBand="0" w:evenHBand="0" w:firstRowFirstColumn="1" w:firstRowLastColumn="0" w:lastRowFirstColumn="0" w:lastRowLastColumn="0"/>
+            <w:tcW w:w="7200" w:type="dxa"/>
+            <w:gridSpan w:val="2"/>
+            <w:noWrap/>
+            <w:hideMark/>
+          </w:tcPr>
+          <w:p>
+            <w:pPr>
+              <w:rPr>
+                <w:rFonts w:ascii="Calibri" w:eastAsia="Times New Roman" w:hAnsi="Calibri" w:cs="Calibri"/>
+                <w:b/>
+                <w:bCs/>
+                <w:color w:val="000000"/>
+              </w:rPr>
+            </w:pPr>
+            <w:r>
+              <w:rPr>
+                <w:rFonts w:ascii="Calibri" w:eastAsia="Times New Roman" w:hAnsi="Calibri" w:cs="Calibri"/>
+                <w:b/>
+                <w:bCs/>
+                <w:color w:val="000000"/>
+              </w:rPr>
+              <w:t>Fundamental Rights Impact Assessment (AIA Component)</w:t>
+            </w:r>
+          </w:p>
+        </w:tc>
+        <w:tc>
+          <w:tcPr>
+            <w:tcW w:w="2570" w:type="dxa"/>
+            <w:noWrap/>
+            <w:hideMark/>
+          </w:tcPr>
+          <w:p>
+            <w:pPr>
+              <w:cnfStyle w:val="100000000000" w:firstRow="1" w:lastRow="0" w:firstColumn="0" w:lastColumn="0" w:oddVBand="0" w:evenVBand="0" w:oddHBand="0" w:evenHBand="0" w:firstRowFirstColumn="0" w:firstRowLastColumn="0" w:lastRowFirstColumn="0" w:lastRowLastColumn="0"/>
+              <w:rPr>
+                <w:rFonts w:ascii="Calibri" w:eastAsia="Times New Roman" w:hAnsi="Calibri" w:cs="Calibri"/>
+                <w:b/>
+                <w:bCs/>
+                <w:color w:val="000000"/>
+              </w:rPr>
+            </w:pPr>
+          </w:p>
+        </w:tc>
+      </w:tr>
+      <w:tr>
+        <w:trPr>
+          <w:cnfStyle w:val="000000100000" w:firstRow="0" w:lastRow="0" w:firstColumn="0" w:lastColumn="0" w:oddVBand="0" w:evenVBand="0" w:oddHBand="1" w:evenHBand="0" w:firstRowFirstColumn="0" w:firstRowLastColumn="0" w:lastRowFirstColumn="0" w:lastRowLastColumn="0"/>
+          <w:divId w:val="1875076936"/>
+          <w:trHeight w:val="288"/>
+        </w:trPr>
+        <w:tc>
+          <w:tcPr>
+            <w:cnfStyle w:val="001000000000" w:firstRow="0" w:lastRow="0" w:firstColumn="1" w:lastColumn="0" w:oddVBand="0" w:evenVBand="0" w:oddHBand="0" w:evenHBand="0" w:firstRowFirstColumn="0" w:firstRowLastColumn="0" w:lastRowFirstColumn="0" w:lastRowLastColumn="0"/>
+            <w:tcW w:w="3180" w:type="dxa"/>
+            <w:noWrap/>
+            <w:hideMark/>
+          </w:tcPr>
+          <w:p>
+            <w:pPr>
+              <w:rPr>
+                <w:rFonts w:eastAsia="Times New Roman"/>
+                <w:sz w:val="20"/>
+                <w:szCs w:val="20"/>
+              </w:rPr>
+            </w:pPr>
+          </w:p>
+        </w:tc>
+        <w:tc>
+          <w:tcPr>
+            <w:tcW w:w="4020" w:type="dxa"/>
+            <w:noWrap/>
+            <w:hideMark/>
+          </w:tcPr>
+          <w:p>
+            <w:pPr>
+              <w:cnfStyle w:val="000000100000" w:firstRow="0" w:lastRow="0" w:firstColumn="0" w:lastColumn="0" w:oddVBand="0" w:evenVBand="0" w:oddHBand="1" w:evenHBand="0" w:firstRowFirstColumn="0" w:firstRowLastColumn="0" w:lastRowFirstColumn="0" w:lastRowLastColumn="0"/>
+              <w:rPr>
+                <w:rFonts w:eastAsia="Times New Roman"/>
+                <w:sz w:val="20"/>
+                <w:szCs w:val="20"/>
+              </w:rPr>
+            </w:pPr>
+          </w:p>
+        </w:tc>
+        <w:tc>
+          <w:tcPr>
+            <w:tcW w:w="2570" w:type="dxa"/>
+            <w:noWrap/>
+            <w:hideMark/>
+          </w:tcPr>
+          <w:p>
+            <w:pPr>
+              <w:cnfStyle w:val="000000100000" w:firstRow="0" w:lastRow="0" w:firstColumn="0" w:lastColumn="0" w:oddVBand="0" w:evenVBand="0" w:oddHBand="1" w:evenHBand="0" w:firstRowFirstColumn="0" w:firstRowLastColumn="0" w:lastRowFirstColumn="0" w:lastRowLastColumn="0"/>
+              <w:rPr>
+                <w:rFonts w:eastAsia="Times New Roman"/>
+                <w:sz w:val="20"/>
+                <w:szCs w:val="20"/>
+              </w:rPr>
+            </w:pPr>
+          </w:p>
+        </w:tc>
+      </w:tr>
+      <w:tr>
+        <w:trPr>
+          <w:divId w:val="1875076936"/>
+          <w:trHeight w:val="288"/>
+        </w:trPr>
+        <w:tc>
+          <w:tcPr>
+            <w:cnfStyle w:val="001000000000" w:firstRow="0" w:lastRow="0" w:firstColumn="1" w:lastColumn="0" w:oddVBand="0" w:evenVBand="0" w:oddHBand="0" w:evenHBand="0" w:firstRowFirstColumn="0" w:firstRowLastColumn="0" w:lastRowFirstColumn="0" w:lastRowLastColumn="0"/>
+            <w:tcW w:w="3180" w:type="dxa"/>
+            <w:hideMark/>
+          </w:tcPr>
+          <w:p>
+            <w:pPr>
+              <w:rPr>
+                <w:rFonts w:ascii="Calibri" w:eastAsia="Times New Roman" w:hAnsi="Calibri" w:cs="Calibri"/>
+                <w:b/>
+                <w:bCs/>
+                <w:color w:val="000000"/>
+                <w:sz w:val="22"/>
+                <w:szCs w:val="22"/>
+              </w:rPr>
+            </w:pPr>
+            <w:r>
+              <w:rPr>
+                <w:rFonts w:ascii="Calibri" w:eastAsia="Times New Roman" w:hAnsi="Calibri" w:cs="Calibri"/>
+                <w:b/>
+                <w:bCs/>
+                <w:color w:val="000000"/>
+                <w:sz w:val="22"/>
+                <w:szCs w:val="22"/>
+              </w:rPr>
+              <w:t>Fundamental Right</w:t>
+            </w:r>
+          </w:p>
+        </w:tc>
+        <w:tc>
+          <w:tcPr>
+            <w:tcW w:w="4020" w:type="dxa"/>
+            <w:hideMark/>
+          </w:tcPr>
+          <w:p>
+            <w:pPr>
+              <w:cnfStyle w:val="000000000000" w:firstRow="0" w:lastRow="0" w:firstColumn="0" w:lastColumn="0" w:oddVBand="0" w:evenVBand="0" w:oddHBand="0" w:evenHBand="0" w:firstRowFirstColumn="0" w:firstRowLastColumn="0" w:lastRowFirstColumn="0" w:lastRowLastColumn="0"/>
+              <w:rPr>
+                <w:rFonts w:ascii="Calibri" w:eastAsia="Times New Roman" w:hAnsi="Calibri" w:cs="Calibri"/>
+                <w:b/>
+                <w:bCs/>
+                <w:color w:val="000000"/>
+                <w:sz w:val="22"/>
+                <w:szCs w:val="22"/>
+              </w:rPr>
+            </w:pPr>
+            <w:r>
+              <w:rPr>
+                <w:rFonts w:ascii="Calibri" w:eastAsia="Times New Roman" w:hAnsi="Calibri" w:cs="Calibri"/>
+                <w:b/>
+                <w:bCs/>
+                <w:color w:val="000000"/>
+                <w:sz w:val="22"/>
+                <w:szCs w:val="22"/>
+              </w:rPr>
+              <w:t>Potential Impact from RecruitSmart AI</w:t>
+            </w:r>
+          </w:p>
+        </w:tc>
+        <w:tc>
+          <w:tcPr>
+            <w:tcW w:w="2570" w:type="dxa"/>
+            <w:hideMark/>
+          </w:tcPr>
+          <w:p>
+            <w:pPr>
+              <w:cnfStyle w:val="000000000000" w:firstRow="0" w:lastRow="0" w:firstColumn="0" w:lastColumn="0" w:oddVBand="0" w:evenVBand="0" w:oddHBand="0" w:evenHBand="0" w:firstRowFirstColumn="0" w:firstRowLastColumn="0" w:lastRowFirstColumn="0" w:lastRowLastColumn="0"/>
+              <w:rPr>
+                <w:rFonts w:ascii="Calibri" w:eastAsia="Times New Roman" w:hAnsi="Calibri" w:cs="Calibri"/>
+                <w:b/>
+                <w:bCs/>
+                <w:color w:val="000000"/>
+                <w:sz w:val="22"/>
+                <w:szCs w:val="22"/>
+              </w:rPr>
+            </w:pPr>
+            <w:r>
+              <w:rPr>
+                <w:rFonts w:ascii="Calibri" w:eastAsia="Times New Roman" w:hAnsi="Calibri" w:cs="Calibri"/>
+                <w:b/>
+                <w:bCs/>
+                <w:color w:val="000000"/>
+                <w:sz w:val="22"/>
+                <w:szCs w:val="22"/>
+              </w:rPr>
+              <w:t>Mitigation Measure (Control)</w:t>
+            </w:r>
+          </w:p>
+        </w:tc>
+      </w:tr>
+      <w:tr>
+        <w:trPr>
+          <w:cnfStyle w:val="000000100000" w:firstRow="0" w:lastRow="0" w:firstColumn="0" w:lastColumn="0" w:oddVBand="0" w:evenVBand="0" w:oddHBand="1" w:evenHBand="0" w:firstRowFirstColumn="0" w:firstRowLastColumn="0" w:lastRowFirstColumn="0" w:lastRowLastColumn="0"/>
+          <w:divId w:val="1875076936"/>
+          <w:trHeight w:val="864"/>
+        </w:trPr>
+        <w:tc>
+          <w:tcPr>
+            <w:cnfStyle w:val="001000000000" w:firstRow="0" w:lastRow="0" w:firstColumn="1" w:lastColumn="0" w:oddVBand="0" w:evenVBand="0" w:oddHBand="0" w:evenHBand="0" w:firstRowFirstColumn="0" w:firstRowLastColumn="0" w:lastRowFirstColumn="0" w:lastRowLastColumn="0"/>
+            <w:tcW w:w="3180" w:type="dxa"/>
+            <w:hideMark/>
+          </w:tcPr>
+          <w:p>
+            <w:pPr>
+              <w:rPr>
+                <w:rFonts w:ascii="Calibri" w:eastAsia="Times New Roman" w:hAnsi="Calibri" w:cs="Calibri"/>
+                <w:color w:val="000000"/>
+                <w:sz w:val="22"/>
+                <w:szCs w:val="22"/>
+              </w:rPr>
+            </w:pPr>
+            <w:r>
+              <w:rPr>
+                <w:rFonts w:ascii="Calibri" w:eastAsia="Times New Roman" w:hAnsi="Calibri" w:cs="Calibri"/>
+                <w:color w:val="000000"/>
+                <w:sz w:val="22"/>
+                <w:szCs w:val="22"/>
+              </w:rPr>
+              <w:t>Non-Discrimination</w:t>
+            </w:r>
+          </w:p>
+        </w:tc>
+        <w:tc>
+          <w:tcPr>
+            <w:tcW w:w="4020" w:type="dxa"/>
+            <w:hideMark/>
+          </w:tcPr>
+          <w:p>
+            <w:pPr>
+              <w:cnfStyle w:val="000000100000" w:firstRow="0" w:lastRow="0" w:firstColumn="0" w:lastColumn="0" w:oddVBand="0" w:evenVBand="0" w:oddHBand="1" w:evenHBand="0" w:firstRowFirstColumn="0" w:firstRowLastColumn="0" w:lastRowFirstColumn="0" w:lastRowLastColumn="0"/>
+              <w:rPr>
+                <w:rFonts w:ascii="Calibri" w:eastAsia="Times New Roman" w:hAnsi="Calibri" w:cs="Calibri"/>
+                <w:color w:val="000000"/>
+                <w:sz w:val="22"/>
+                <w:szCs w:val="22"/>
+              </w:rPr>
+            </w:pPr>
+            <w:r>
+              <w:rPr>
+                <w:rFonts w:ascii="Calibri" w:eastAsia="Times New Roman" w:hAnsi="Calibri" w:cs="Calibri"/>
+                <w:color w:val="000000"/>
+                <w:sz w:val="22"/>
+                <w:szCs w:val="22"/>
+              </w:rPr>
+              <w:t>AI model may favor specific demographics (e.g., gender, age, or ethnicity) based on historical bias in training data.</w:t>
+            </w:r>
+          </w:p>
+        </w:tc>
+        <w:tc>
+          <w:tcPr>
+            <w:tcW w:w="2570" w:type="dxa"/>
+            <w:hideMark/>
+          </w:tcPr>
+          <w:p>
+            <w:pPr>
+              <w:cnfStyle w:val="000000100000" w:firstRow="0" w:lastRow="0" w:firstColumn="0" w:lastColumn="0" w:oddVBand="0" w:evenVBand="0" w:oddHBand="1" w:evenHBand="0" w:firstRowFirstColumn="0" w:firstRowLastColumn="0" w:lastRowFirstColumn="0" w:lastRowLastColumn="0"/>
+              <w:rPr>
+                <w:rFonts w:ascii="Calibri" w:eastAsia="Times New Roman" w:hAnsi="Calibri" w:cs="Calibri"/>
+                <w:color w:val="000000"/>
+                <w:sz w:val="22"/>
+                <w:szCs w:val="22"/>
+              </w:rPr>
+            </w:pPr>
+            <w:r>
+              <w:rPr>
+                <w:rFonts w:ascii="Calibri" w:eastAsia="Times New Roman" w:hAnsi="Calibri" w:cs="Calibri"/>
+                <w:color w:val="000000"/>
+                <w:sz w:val="22"/>
+                <w:szCs w:val="22"/>
+              </w:rPr>
+              <w:t>Implementation of Fairness Metrics; conducting periodic bias-testing on protected attributes; using diverse training datasets.</w:t>
+            </w:r>
+          </w:p>
+        </w:tc>
+      </w:tr>
+      <w:tr>
+        <w:trPr>
+          <w:divId w:val="1875076936"/>
+          <w:trHeight w:val="864"/>
+        </w:trPr>
+        <w:tc>
+          <w:tcPr>
+            <w:cnfStyle w:val="001000000000" w:firstRow="0" w:lastRow="0" w:firstColumn="1" w:lastColumn="0" w:oddVBand="0" w:evenVBand="0" w:oddHBand="0" w:evenHBand="0" w:firstRowFirstColumn="0" w:firstRowLastColumn="0" w:lastRowFirstColumn="0" w:lastRowLastColumn="0"/>
+            <w:tcW w:w="3180" w:type="dxa"/>
+            <w:hideMark/>
+          </w:tcPr>
+          <w:p>
+            <w:pPr>
+              <w:rPr>
+                <w:rFonts w:ascii="Calibri" w:eastAsia="Times New Roman" w:hAnsi="Calibri" w:cs="Calibri"/>
+                <w:color w:val="000000"/>
+                <w:sz w:val="22"/>
+                <w:szCs w:val="22"/>
+              </w:rPr>
+            </w:pPr>
+            <w:r>
+              <w:rPr>
+                <w:rFonts w:ascii="Calibri" w:eastAsia="Times New Roman" w:hAnsi="Calibri" w:cs="Calibri"/>
+                <w:color w:val="000000"/>
+                <w:sz w:val="22"/>
+                <w:szCs w:val="22"/>
+              </w:rPr>
+              <w:t>Right to Work</w:t>
+            </w:r>
+          </w:p>
+        </w:tc>
+        <w:tc>
+          <w:tcPr>
+            <w:tcW w:w="4020" w:type="dxa"/>
+            <w:hideMark/>
+          </w:tcPr>
+          <w:p>
+            <w:pPr>
+              <w:cnfStyle w:val="000000000000" w:firstRow="0" w:lastRow="0" w:firstColumn="0" w:lastColumn="0" w:oddVBand="0" w:evenVBand="0" w:oddHBand="0" w:evenHBand="0" w:firstRowFirstColumn="0" w:firstRowLastColumn="0" w:lastRowFirstColumn="0" w:lastRowLastColumn="0"/>
+              <w:rPr>
+                <w:rFonts w:ascii="Calibri" w:eastAsia="Times New Roman" w:hAnsi="Calibri" w:cs="Calibri"/>
+                <w:color w:val="000000"/>
+                <w:sz w:val="22"/>
+                <w:szCs w:val="22"/>
+              </w:rPr>
+            </w:pPr>
+            <w:r>
+              <w:rPr>
+                <w:rFonts w:ascii="Calibri" w:eastAsia="Times New Roman" w:hAnsi="Calibri" w:cs="Calibri"/>
+                <w:color w:val="000000"/>
+                <w:sz w:val="22"/>
+                <w:szCs w:val="22"/>
+              </w:rPr>
+              <w:t>Automated "hard" rejection could unfairly block a candidate's access to employment opportunities without a fair hearing.</w:t>
+            </w:r>
+          </w:p>
+        </w:tc>
+        <w:tc>
+          <w:tcPr>
+            <w:tcW w:w="2570" w:type="dxa"/>
+            <w:hideMark/>
+          </w:tcPr>
+          <w:p>
+            <w:pPr>
+              <w:cnfStyle w:val="000000000000" w:firstRow="0" w:lastRow="0" w:firstColumn="0" w:lastColumn="0" w:oddVBand="0" w:evenVBand="0" w:oddHBand="0" w:evenHBand="0" w:firstRowFirstColumn="0" w:firstRowLastColumn="0" w:lastRowFirstColumn="0" w:lastRowLastColumn="0"/>
+              <w:rPr>
+                <w:rFonts w:ascii="Calibri" w:eastAsia="Times New Roman" w:hAnsi="Calibri" w:cs="Calibri"/>
+                <w:color w:val="000000"/>
+                <w:sz w:val="22"/>
+                <w:szCs w:val="22"/>
+              </w:rPr>
+            </w:pPr>
+            <w:r>
+              <w:rPr>
+                <w:rFonts w:ascii="Calibri" w:eastAsia="Times New Roman" w:hAnsi="Calibri" w:cs="Calibri"/>
+                <w:color w:val="000000"/>
+                <w:sz w:val="22"/>
+                <w:szCs w:val="22"/>
+              </w:rPr>
+              <w:t>Mandatory "Human-in-the-Loop" (HITL) protocol; all automated rejections require a final verification by an HR professional.</w:t>
+            </w:r>
+          </w:p>
+        </w:tc>
+      </w:tr>
+      <w:tr>
+        <w:trPr>
+          <w:cnfStyle w:val="000000100000" w:firstRow="0" w:lastRow="0" w:firstColumn="0" w:lastColumn="0" w:oddVBand="0" w:evenVBand="0" w:oddHBand="1" w:evenHBand="0" w:firstRowFirstColumn="0" w:firstRowLastColumn="0" w:lastRowFirstColumn="0" w:lastRowLastColumn="0"/>
+          <w:divId w:val="1875076936"/>
+          <w:trHeight w:val="864"/>
+        </w:trPr>
+        <w:tc>
+          <w:tcPr>
+            <w:cnfStyle w:val="001000000000" w:firstRow="0" w:lastRow="0" w:firstColumn="1" w:lastColumn="0" w:oddVBand="0" w:evenVBand="0" w:oddHBand="0" w:evenHBand="0" w:firstRowFirstColumn="0" w:firstRowLastColumn="0" w:lastRowFirstColumn="0" w:lastRowLastColumn="0"/>
+            <w:tcW w:w="3180" w:type="dxa"/>
+            <w:hideMark/>
+          </w:tcPr>
+          <w:p>
+            <w:pPr>
+              <w:rPr>
+                <w:rFonts w:ascii="Calibri" w:eastAsia="Times New Roman" w:hAnsi="Calibri" w:cs="Calibri"/>
+                <w:color w:val="000000"/>
+                <w:sz w:val="22"/>
+                <w:szCs w:val="22"/>
+              </w:rPr>
+            </w:pPr>
+            <w:r>
+              <w:rPr>
+                <w:rFonts w:ascii="Calibri" w:eastAsia="Times New Roman" w:hAnsi="Calibri" w:cs="Calibri"/>
+                <w:color w:val="000000"/>
+                <w:sz w:val="22"/>
+                <w:szCs w:val="22"/>
+              </w:rPr>
+              <w:lastRenderedPageBreak/>
+              <w:t>Human Dignity</w:t>
+            </w:r>
+          </w:p>
+        </w:tc>
+        <w:tc>
+          <w:tcPr>
+            <w:tcW w:w="4020" w:type="dxa"/>
+            <w:hideMark/>
+          </w:tcPr>
+          <w:p>
+            <w:pPr>
+              <w:cnfStyle w:val="000000100000" w:firstRow="0" w:lastRow="0" w:firstColumn="0" w:lastColumn="0" w:oddVBand="0" w:evenVBand="0" w:oddHBand="1" w:evenHBand="0" w:firstRowFirstColumn="0" w:firstRowLastColumn="0" w:lastRowFirstColumn="0" w:lastRowLastColumn="0"/>
+              <w:rPr>
+                <w:rFonts w:ascii="Calibri" w:eastAsia="Times New Roman" w:hAnsi="Calibri" w:cs="Calibri"/>
+                <w:color w:val="000000"/>
+                <w:sz w:val="22"/>
+                <w:szCs w:val="22"/>
+              </w:rPr>
+            </w:pPr>
+            <w:r>
+              <w:rPr>
+                <w:rFonts w:ascii="Calibri" w:eastAsia="Times New Roman" w:hAnsi="Calibri" w:cs="Calibri"/>
+                <w:color w:val="000000"/>
+                <w:sz w:val="22"/>
+                <w:szCs w:val="22"/>
+              </w:rPr>
+              <w:t>Candidates may feel "dehumanized" or judged solely by a machine algorithm without a personal voice.</w:t>
+            </w:r>
+          </w:p>
+        </w:tc>
+        <w:tc>
+          <w:tcPr>
+            <w:tcW w:w="2570" w:type="dxa"/>
+            <w:hideMark/>
+          </w:tcPr>
+          <w:p>
+            <w:pPr>
+              <w:cnfStyle w:val="000000100000" w:firstRow="0" w:lastRow="0" w:firstColumn="0" w:lastColumn="0" w:oddVBand="0" w:evenVBand="0" w:oddHBand="1" w:evenHBand="0" w:firstRowFirstColumn="0" w:firstRowLastColumn="0" w:lastRowFirstColumn="0" w:lastRowLastColumn="0"/>
+              <w:rPr>
+                <w:rFonts w:ascii="Calibri" w:eastAsia="Times New Roman" w:hAnsi="Calibri" w:cs="Calibri"/>
+                <w:color w:val="000000"/>
+                <w:sz w:val="22"/>
+                <w:szCs w:val="22"/>
+              </w:rPr>
+            </w:pPr>
+            <w:r>
+              <w:rPr>
+                <w:rFonts w:ascii="Calibri" w:eastAsia="Times New Roman" w:hAnsi="Calibri" w:cs="Calibri"/>
+                <w:color w:val="000000"/>
+                <w:sz w:val="22"/>
+                <w:szCs w:val="22"/>
+              </w:rPr>
+              <w:t>Provide a clear "Right to Explanation"; establish a dedicated human-led appeal channel for candidates to contest AI scores.</w:t>
+            </w:r>
+          </w:p>
+        </w:tc>
+      </w:tr>
+      <w:tr>
+        <w:trPr>
+          <w:divId w:val="1875076936"/>
+          <w:trHeight w:val="864"/>
+        </w:trPr>
+        <w:tc>
+          <w:tcPr>
+            <w:cnfStyle w:val="001000000000" w:firstRow="0" w:lastRow="0" w:firstColumn="1" w:lastColumn="0" w:oddVBand="0" w:evenVBand="0" w:oddHBand="0" w:evenHBand="0" w:firstRowFirstColumn="0" w:firstRowLastColumn="0" w:lastRowFirstColumn="0" w:lastRowLastColumn="0"/>
+            <w:tcW w:w="3180" w:type="dxa"/>
+            <w:hideMark/>
+          </w:tcPr>
+          <w:p>
+            <w:pPr>
+              <w:rPr>
+                <w:rFonts w:ascii="Calibri" w:eastAsia="Times New Roman" w:hAnsi="Calibri" w:cs="Calibri"/>
+                <w:color w:val="000000"/>
+                <w:sz w:val="22"/>
+                <w:szCs w:val="22"/>
+              </w:rPr>
+            </w:pPr>
+            <w:r>
+              <w:rPr>
+                <w:rFonts w:ascii="Calibri" w:eastAsia="Times New Roman" w:hAnsi="Calibri" w:cs="Calibri"/>
+                <w:color w:val="000000"/>
+                <w:sz w:val="22"/>
+                <w:szCs w:val="22"/>
+              </w:rPr>
+              <w:t>Right to Redress</w:t>
+            </w:r>
+          </w:p>
+        </w:tc>
+        <w:tc>
+          <w:tcPr>
+            <w:tcW w:w="4020" w:type="dxa"/>
+            <w:hideMark/>
+          </w:tcPr>
+          <w:p>
+            <w:pPr>
+              <w:cnfStyle w:val="000000000000" w:firstRow="0" w:lastRow="0" w:firstColumn="0" w:lastColumn="0" w:oddVBand="0" w:evenVBand="0" w:oddHBand="0" w:evenHBand="0" w:firstRowFirstColumn="0" w:firstRowLastColumn="0" w:lastRowFirstColumn="0" w:lastRowLastColumn="0"/>
+              <w:rPr>
+                <w:rFonts w:ascii="Calibri" w:eastAsia="Times New Roman" w:hAnsi="Calibri" w:cs="Calibri"/>
+                <w:color w:val="000000"/>
+                <w:sz w:val="22"/>
+                <w:szCs w:val="22"/>
+              </w:rPr>
+            </w:pPr>
+            <w:r>
+              <w:rPr>
+                <w:rFonts w:ascii="Calibri" w:eastAsia="Times New Roman" w:hAnsi="Calibri" w:cs="Calibri"/>
+                <w:color w:val="000000"/>
+                <w:sz w:val="22"/>
+                <w:szCs w:val="22"/>
+              </w:rPr>
+              <w:t>Candidates lack a way to challenge an incorrect or flawed AI evaluation of their professional skills.</w:t>
+            </w:r>
+          </w:p>
+        </w:tc>
+        <w:tc>
+          <w:tcPr>
+            <w:tcW w:w="2570" w:type="dxa"/>
+            <w:hideMark/>
+          </w:tcPr>
+          <w:p>
+            <w:pPr>
+              <w:cnfStyle w:val="000000000000" w:firstRow="0" w:lastRow="0" w:firstColumn="0" w:lastColumn="0" w:oddVBand="0" w:evenVBand="0" w:oddHBand="0" w:evenHBand="0" w:firstRowFirstColumn="0" w:firstRowLastColumn="0" w:lastRowFirstColumn="0" w:lastRowLastColumn="0"/>
+              <w:rPr>
+                <w:rFonts w:ascii="Calibri" w:eastAsia="Times New Roman" w:hAnsi="Calibri" w:cs="Calibri"/>
+                <w:color w:val="000000"/>
+                <w:sz w:val="22"/>
+                <w:szCs w:val="22"/>
+              </w:rPr>
+            </w:pPr>
+            <w:r>
+              <w:rPr>
+                <w:rFonts w:ascii="Calibri" w:eastAsia="Times New Roman" w:hAnsi="Calibri" w:cs="Calibri"/>
+                <w:color w:val="000000"/>
+                <w:sz w:val="22"/>
+                <w:szCs w:val="22"/>
+              </w:rPr>
+              <w:t>Clear Transparency Disclosures at the point of data collection; automated generation of score justifications for audit trails.</w:t>
+            </w:r>
+          </w:p>
+        </w:tc>
+      </w:tr>
+    </w:tbl>
+    <w:p>
+      <w:pPr>
+        <w:pStyle w:val="Heading2"/>
+        <w:divId w:val="1875076936"/>
+        <w:rPr>
+          <w:rFonts w:eastAsia="Times New Roman"/>
+        </w:rPr>
+      </w:pPr>
+    </w:p>
+    <w:p>
+      <w:pPr>
+        <w:pStyle w:val="Heading2"/>
+        <w:divId w:val="1875076936"/>
+        <w:rPr>
+          <w:rFonts w:eastAsia="Times New Roman"/>
+        </w:rPr>
+      </w:pPr>
+    </w:p>
+    <w:p>
+      <w:pPr>
+        <w:pStyle w:val="Heading2"/>
+        <w:divId w:val="1875076936"/>
+        <w:rPr>
+          <w:rFonts w:eastAsia="Times New Roman"/>
+        </w:rPr>
+      </w:pPr>
+    </w:p>
+    <w:p>
+      <w:pPr>
+        <w:pStyle w:val="Heading2"/>
+        <w:divId w:val="1875076936"/>
+        <w:rPr>
+          <w:rFonts w:eastAsia="Times New Roman"/>
+        </w:rPr>
+      </w:pPr>
+    </w:p>
+    <w:p>
+      <w:pPr>
+        <w:pStyle w:val="Heading2"/>
+        <w:divId w:val="1875076936"/>
+        <w:rPr>
+          <w:rFonts w:eastAsia="Times New Roman"/>
+        </w:rPr>
+      </w:pPr>
+    </w:p>
+    <w:p>
+      <w:pPr>
+        <w:pStyle w:val="Heading2"/>
+        <w:divId w:val="1875076936"/>
+        <w:rPr>
+          <w:rFonts w:eastAsia="Times New Roman"/>
+        </w:rPr>
+      </w:pPr>
+      <w:r>
+        <w:rPr>
+          <w:rFonts w:eastAsia="Times New Roman"/>
+        </w:rPr>
+        <w:t>2. High-Risk AI Technical Controls (Article 13-15)</w:t>
+      </w:r>
+    </w:p>
+    <w:p>
+      <w:pPr>
+        <w:pStyle w:val="Heading2"/>
+        <w:divId w:val="1875076936"/>
+        <w:rPr>
+          <w:rFonts w:eastAsia="Times New Roman"/>
+        </w:rPr>
+      </w:pPr>
+      <w:r>
+        <w:rPr>
+          <w:rFonts w:eastAsia="Times New Roman"/>
+        </w:rPr>
+        <w:t>The EU AI Act requires "High-Risk" systems (like recruitment tools) to have specific technical "Vitamins."</w:t>
+      </w:r>
+    </w:p>
+    <w:p>
+      <w:pPr>
+        <w:pStyle w:val="Heading2"/>
+        <w:divId w:val="1875076936"/>
+        <w:rPr>
+          <w:rFonts w:eastAsia="Times New Roman"/>
+        </w:rPr>
+      </w:pPr>
+    </w:p>
+    <w:p>
+      <w:pPr>
+        <w:pStyle w:val="Heading2"/>
+        <w:divId w:val="1875076936"/>
+        <w:rPr>
+          <w:rFonts w:eastAsia="Times New Roman"/>
+        </w:rPr>
+      </w:pPr>
+      <w:r>
+        <w:rPr>
+          <w:rFonts w:eastAsia="Times New Roman"/>
+        </w:rPr>
+        <w:t xml:space="preserve">A. Accuracy &amp; Robustness: </w:t>
+      </w:r>
+    </w:p>
+    <w:p>
+      <w:pPr>
+        <w:pStyle w:val="Heading2"/>
+        <w:divId w:val="1875076936"/>
+        <w:rPr>
+          <w:rFonts w:eastAsia="Times New Roman"/>
+        </w:rPr>
+      </w:pPr>
+      <w:r>
+        <w:rPr>
+          <w:rFonts w:eastAsia="Times New Roman"/>
+        </w:rPr>
+        <w:t>The model is tested against a 'Golden Dataset' to ensure a 95% accuracy rate in skill extraction from CVs."</w:t>
+      </w:r>
+    </w:p>
+    <w:p>
+      <w:pPr>
+        <w:pStyle w:val="Heading2"/>
+        <w:divId w:val="1875076936"/>
+        <w:rPr>
+          <w:rFonts w:eastAsia="Times New Roman"/>
+        </w:rPr>
+      </w:pPr>
+    </w:p>
+    <w:p>
+      <w:pPr>
+        <w:pStyle w:val="Heading2"/>
+        <w:divId w:val="1875076936"/>
+        <w:rPr>
+          <w:rFonts w:eastAsia="Times New Roman"/>
+        </w:rPr>
+      </w:pPr>
+    </w:p>
+    <w:p>
+      <w:pPr>
+        <w:pStyle w:val="Heading2"/>
+        <w:divId w:val="1875076936"/>
+        <w:rPr>
+          <w:rFonts w:eastAsia="Times New Roman"/>
+        </w:rPr>
+      </w:pPr>
+      <w:r>
+        <w:rPr>
+          <w:rFonts w:eastAsia="Times New Roman"/>
+        </w:rPr>
+        <w:lastRenderedPageBreak/>
+        <w:t>B. Automated Logging: You must keep records of the AI's decisions.</w:t>
+      </w:r>
+    </w:p>
+    <w:p>
+      <w:pPr>
+        <w:pStyle w:val="Heading2"/>
+        <w:divId w:val="1875076936"/>
+        <w:rPr>
+          <w:rFonts w:eastAsia="Times New Roman"/>
+        </w:rPr>
+      </w:pPr>
+      <w:r>
+        <w:rPr>
+          <w:rFonts w:eastAsia="Times New Roman"/>
+        </w:rPr>
+        <w:t>The system maintains an immutable log of every score generated, stored in MongoDB, to allow for retrospective auditing by the CNIL or regulators."</w:t>
+      </w:r>
+    </w:p>
+    <w:p>
+      <w:pPr>
+        <w:pStyle w:val="Heading2"/>
+        <w:divId w:val="1875076936"/>
+        <w:rPr>
+          <w:rFonts w:eastAsia="Times New Roman"/>
+        </w:rPr>
+      </w:pPr>
+    </w:p>
+    <w:p>
+      <w:pPr>
+        <w:pStyle w:val="Heading2"/>
+        <w:divId w:val="1875076936"/>
+        <w:rPr>
+          <w:rFonts w:eastAsia="Times New Roman"/>
+        </w:rPr>
+      </w:pPr>
+      <w:r>
+        <w:rPr>
+          <w:rFonts w:eastAsia="Times New Roman"/>
+        </w:rPr>
+        <w:t>C. Human Oversight:</w:t>
+      </w:r>
+    </w:p>
+    <w:p>
+      <w:pPr>
+        <w:pStyle w:val="Heading2"/>
+        <w:divId w:val="1875076936"/>
+        <w:rPr>
+          <w:rFonts w:eastAsia="Times New Roman"/>
+        </w:rPr>
+      </w:pPr>
+      <w:r>
+        <w:rPr>
+          <w:rFonts w:eastAsia="Times New Roman"/>
+        </w:rPr>
+        <w:t>RecruitSmart features an 'Override Button' for HR Managers. The AI suggests, but the Human Decides. No candidate is rejected without a human reviewing the AI's reasoning.</w:t>
+      </w:r>
+    </w:p>
+    <w:p>
+      <w:pPr>
+        <w:pStyle w:val="Heading2"/>
+        <w:divId w:val="1875076936"/>
+        <w:rPr>
+          <w:rFonts w:eastAsia="Times New Roman"/>
+        </w:rPr>
+      </w:pPr>
+    </w:p>
+    <w:p>
+      <w:pPr>
+        <w:pStyle w:val="Heading2"/>
+        <w:divId w:val="1875076936"/>
+        <w:rPr>
+          <w:rFonts w:eastAsia="Times New Roman"/>
+        </w:rPr>
+      </w:pPr>
+      <w:r>
+        <w:rPr>
+          <w:rFonts w:eastAsia="Times New Roman"/>
+        </w:rPr>
+        <w:t>3. Transparency Clause:</w:t>
+      </w:r>
+    </w:p>
+    <w:p>
+      <w:pPr>
+        <w:pStyle w:val="Heading2"/>
+        <w:divId w:val="1875076936"/>
+        <w:rPr>
+          <w:rFonts w:eastAsia="Times New Roman"/>
+        </w:rPr>
+      </w:pPr>
+      <w:r>
+        <w:rPr>
+          <w:rFonts w:eastAsia="Times New Roman"/>
+        </w:rPr>
+        <w:t>RecruitSmart provides a 'Match-Score Breakdown' for every candidate. If a candidate is not shortlisted, the system generates a summary of the missing skills or experience levels identified by the NLP engine, ensuring the decision-making process is not a 'Black Box'.</w:t>
+      </w:r>
+    </w:p>
+    <w:p>
+      <w:pPr>
+        <w:pStyle w:val="Heading2"/>
+        <w:divId w:val="1875076936"/>
+        <w:rPr>
+          <w:rFonts w:eastAsia="Times New Roman"/>
+        </w:rPr>
+      </w:pPr>
     </w:p>
     <w:sectPr>
       <w:pgSz w:w="12240" w:h="15840"/>

</xml_diff>